<commit_message>
App adjusted for new letter
</commit_message>
<xml_diff>
--- a/Template.docx
+++ b/Template.docx
@@ -209,23 +209,7 @@
           <w:szCs w:val="24"/>
           <w:rtl w:val="0"/>
         </w:rPr>
-        <w:t xml:space="preserve">The purpose of this letter is to inform you that {{title}} {{lastname}} has retained The Law Guys regarding the mistreatment that {{pronoun}} endured as an employee of {{company}}. Specifically, {{title}} {{lastname}} is seeking to reach mutually agreeable settlement terms, in exchange for which {{pronoun}} {{verb}} willing to sign a standard release of any and all legal claims against your company. Importantly, after consulting with my client, it is clear that {{title}} {{lastname}} does, in fact, have valid legal claims against your company including, but not limited to, multiple violations of the California Labor Code. Accordingly, {{company}} is liable to {{title}} {{lastname}} for damages as detailed below. </w:t>
-      </w:r>
-    </w:p>
-    <w:p>
-      <w:pPr>
-        <w:widowControl w:val="0"/>
-        <w:jc w:val="both"/>
-        <w:rPr>
-          <w:rFonts w:ascii="Garamond" w:cs="Garamond" w:eastAsia="Garamond" w:hAnsi="Garamond"/>
-          <w:sz w:val="24"/>
-          <w:szCs w:val="24"/>
-        </w:rPr>
-      </w:pPr>
-      <w:r>
-        <w:rPr>
-          <w:rtl w:val="0"/>
-        </w:rPr>
+        <w:t xml:space="preserve">The purpose of this letter is to inform you that {{title}} {{lastname}} has retained The Law Guys regarding the mistreatment that {{pronoun}} endured as an employee of {{company}}. Specifically, {{title}} {{lastname}} was denied {{possessive}} breaks during {{custom_sentence1}}. Accordingly, {{company}} is liable to {{title}} {{lastname}} for damages as detailed below.</w:t>
       </w:r>
     </w:p>
     <w:p>
@@ -241,346 +225,16 @@
       </w:pPr>
       <w:r>
         <w:rPr>
-          <w:rFonts w:ascii="Garamond" w:cs="Garamond" w:eastAsia="Garamond" w:hAnsi="Garamond"/>
-          <w:sz w:val="24"/>
-          <w:szCs w:val="24"/>
-          <w:rtl w:val="0"/>
-        </w:rPr>
-        <w:t xml:space="preserve">{{title}} {{lastname}} works {{workinghours}} per scheduled shift, {{workingdays}} days per week. Accordingly, for each shift at {{company}}, {{title}} {{lastname}} {{verb}} entitled to one meal break and two rest breaks. {{violation_narrative}}</w:t>
-      </w:r>
-    </w:p>
-    <w:p>
-      <w:pPr>
-        <w:widowControl w:val="0"/>
-        <w:jc w:val="both"/>
-        <w:rPr>
-          <w:rFonts w:ascii="Garamond" w:cs="Garamond" w:eastAsia="Garamond" w:hAnsi="Garamond"/>
-          <w:sz w:val="24"/>
-          <w:szCs w:val="24"/>
-        </w:rPr>
-      </w:pPr>
-      <w:r>
-        <w:rPr>
-          <w:rtl w:val="0"/>
-        </w:rPr>
-      </w:r>
-    </w:p>
-    <w:p>
-      <w:pPr>
-        <w:widowControl w:val="0"/>
-        <w:ind w:firstLine="960"/>
-        <w:jc w:val="both"/>
-        <w:rPr>
-          <w:rFonts w:ascii="Garamond" w:cs="Garamond" w:eastAsia="Garamond" w:hAnsi="Garamond"/>
-          <w:sz w:val="24"/>
-          <w:szCs w:val="24"/>
-        </w:rPr>
-      </w:pPr>
-      <w:r>
-        <w:rPr>
-          <w:rFonts w:ascii="Garamond" w:cs="Garamond" w:eastAsia="Garamond" w:hAnsi="Garamond"/>
-          <w:sz w:val="24"/>
-          <w:szCs w:val="24"/>
-          <w:rtl w:val="0"/>
-        </w:rPr>
-        <w:t xml:space="preserve">The California Supreme Court in </w:t>
-      </w:r>
-      <w:r>
-        <w:rPr>
-          <w:rFonts w:ascii="Garamond" w:cs="Garamond" w:eastAsia="Garamond" w:hAnsi="Garamond"/>
-          <w:i w:val="1"/>
-          <w:iCs w:val="1"/>
-          <w:sz w:val="24"/>
-          <w:szCs w:val="24"/>
-          <w:rtl w:val="0"/>
-        </w:rPr>
-        <w:t xml:space="preserve">Naranjo v. Spectrum Security Services, Inc.</w:t>
-      </w:r>
-      <w:r>
-        <w:rPr>
-          <w:rFonts w:ascii="Garamond" w:cs="Garamond" w:eastAsia="Garamond" w:hAnsi="Garamond"/>
-          <w:sz w:val="24"/>
-          <w:szCs w:val="24"/>
-          <w:rtl w:val="0"/>
-        </w:rPr>
-        <w:t xml:space="preserve"> determined that unpaid break premiums constitute wages that can trigger derivative wage claims penalties. California Labor Code §512 requires an employer to give an employee a 30 minute meal break if the employee works in excess of six hours. Additionally, Industrial Welfare Commission Order No. 5-2001 (12A) requires that an employer provide its employee with a ten minute break for rest time for every four hours worked, or significant fraction thereof. California Labor Code §226.7 provides that the “employer shall pay the employee one additional hour of pay at the employee’s regular rate of compensation for each workday that the meal or rest or recovery period is not provided,” which is capped at one meal break and one rest break penalty per day. (</w:t>
-      </w:r>
-      <w:r>
-        <w:rPr>
-          <w:rFonts w:ascii="Garamond" w:cs="Garamond" w:eastAsia="Garamond" w:hAnsi="Garamond"/>
-          <w:i w:val="1"/>
-          <w:iCs w:val="1"/>
-          <w:sz w:val="24"/>
-          <w:szCs w:val="24"/>
-          <w:rtl w:val="0"/>
-        </w:rPr>
-        <w:t xml:space="preserve">Marlo v. United Parcel Service, Inc.</w:t>
-      </w:r>
-      <w:r>
-        <w:rPr>
-          <w:rFonts w:ascii="Garamond" w:cs="Garamond" w:eastAsia="Garamond" w:hAnsi="Garamond"/>
-          <w:sz w:val="24"/>
-          <w:szCs w:val="24"/>
-          <w:rtl w:val="0"/>
-        </w:rPr>
-        <w:t xml:space="preserve"> (2011) 639 F. 3d 942.)</w:t>
-      </w:r>
-    </w:p>
-    <w:p>
-      <w:pPr>
-        <w:widowControl w:val="0"/>
-        <w:ind w:firstLine="960"/>
-        <w:jc w:val="both"/>
-        <w:rPr>
-          <w:rFonts w:ascii="Garamond" w:cs="Garamond" w:eastAsia="Garamond" w:hAnsi="Garamond"/>
-          <w:sz w:val="24"/>
-          <w:szCs w:val="24"/>
-        </w:rPr>
-      </w:pPr>
-      <w:r>
-        <w:rPr>
-          <w:rtl w:val="0"/>
-        </w:rPr>
-      </w:r>
-    </w:p>
-    <w:p>
-      <w:pPr>
-        <w:widowControl w:val="0"/>
-        <w:ind w:firstLine="960"/>
-        <w:jc w:val="both"/>
-        <w:rPr>
-          <w:rFonts w:ascii="Garamond" w:cs="Garamond" w:eastAsia="Garamond" w:hAnsi="Garamond"/>
-          <w:sz w:val="24"/>
-          <w:szCs w:val="24"/>
-        </w:rPr>
-      </w:pPr>
-      <w:r>
-        <w:rPr>
-          <w:rFonts w:ascii="Garamond" w:cs="Garamond" w:eastAsia="Garamond" w:hAnsi="Garamond"/>
-          <w:sz w:val="24"/>
-          <w:szCs w:val="24"/>
-          <w:rtl w:val="0"/>
-        </w:rPr>
-        <w:t xml:space="preserve">Moreover, California Labor Code section 204 provides that payment for all wages earned by an employee during the course of {{possessive}} employment is due and payable twice each calendar month. An employer’s failure to pay wages results in a penalty of $100 for the first violation and $200 for each additional violation, plus 25% of the amount unlawfully withheld. (Cal. Labor Code § 210.) Additionally, California Labor Code section 226(a) requires employers to furnish their employees with accurate itemized statements showing the total hours worked by the employee for each pay period. Any failure to accurately furnish this information renders the employer liable for actual damages, or $50.00 for the first violation and $100.00 for each additional violation, whichever is greater.  Finally, Mr. Canales is entitled to recover reasonable costs and attorney’s fees.  (Cal. Labor Code § 218.5.)</w:t>
-      </w:r>
-    </w:p>
-    <w:p>
-      <w:pPr>
-        <w:widowControl w:val="0"/>
-        <w:ind w:firstLine="960"/>
-        <w:jc w:val="both"/>
-        <w:rPr>
-          <w:rFonts w:ascii="Garamond" w:cs="Garamond" w:eastAsia="Garamond" w:hAnsi="Garamond"/>
-          <w:sz w:val="24"/>
-          <w:szCs w:val="24"/>
-        </w:rPr>
-      </w:pPr>
-      <w:r>
-        <w:rPr>
-          <w:rtl w:val="0"/>
-        </w:rPr>
-      </w:r>
-    </w:p>
-    <w:p>
-      <w:pPr>
-        <w:widowControl w:val="0"/>
-        <w:ind w:firstLine="960"/>
-        <w:jc w:val="both"/>
-        <w:rPr>
-          <w:rFonts w:ascii="Garamond" w:cs="Garamond" w:eastAsia="Garamond" w:hAnsi="Garamond"/>
-          <w:sz w:val="24"/>
-          <w:szCs w:val="24"/>
-        </w:rPr>
-      </w:pPr>
-      <w:r>
-        <w:rPr>
-          <w:rFonts w:ascii="Garamond" w:cs="Garamond" w:eastAsia="Garamond" w:hAnsi="Garamond"/>
-          <w:sz w:val="24"/>
-          <w:szCs w:val="24"/>
-          <w:rtl w:val="0"/>
-        </w:rPr>
-        <w:t xml:space="preserve">{{title}} {{lastname}} is a full-time employee at {{company}} and works an average of {{workinghours}} hours per scheduled shift. Moreover, {{possessive}} rate of pay is ${{payrate}} per labor hour. Accordingly, {{company}} is liable to {{title}} {{lastname}} in the amount of ${{total_sum}}, excluding costs and fees, as detailed below:</w:t>
-      </w:r>
-    </w:p>
-    <w:p>
-      <w:pPr>
-        <w:widowControl w:val="0"/>
-        <w:jc w:val="center"/>
-        <w:rPr>
-          <w:rFonts w:ascii="Garamond" w:cs="Garamond" w:eastAsia="Garamond" w:hAnsi="Garamond"/>
-          <w:b w:val="1"/>
-          <w:bCs w:val="1"/>
-          <w:sz w:val="24"/>
-          <w:szCs w:val="24"/>
-        </w:rPr>
-      </w:pPr>
-      <w:r>
-        <w:rPr>
-          <w:rtl w:val="0"/>
-        </w:rPr>
-      </w:r>
-    </w:p>
-    <w:p>
-      <w:pPr>
-        <w:widowControl w:val="0"/>
-        <w:jc w:val="center"/>
-        <w:rPr>
-          <w:rFonts w:ascii="Garamond" w:cs="Garamond" w:eastAsia="Garamond" w:hAnsi="Garamond"/>
-          <w:b w:val="1"/>
-          <w:bCs w:val="1"/>
-          <w:sz w:val="24"/>
-          <w:szCs w:val="24"/>
-        </w:rPr>
-      </w:pPr>
-      <w:r>
-        <w:rPr>
-          <w:rFonts w:ascii="Garamond" w:cs="Garamond" w:eastAsia="Garamond" w:hAnsi="Garamond"/>
-          <w:b w:val="1"/>
-          <w:bCs w:val="1"/>
-          <w:sz w:val="24"/>
-          <w:szCs w:val="24"/>
-          <w:rtl w:val="0"/>
-        </w:rPr>
-        <w:t xml:space="preserve">Denied Meal Breaks: {{mealbreakshifts}} shifts at ${{payrate}}/shift = ${{mealbreak_total}}</w:t>
-      </w:r>
-    </w:p>
-    <w:p>
-      <w:pPr>
-        <w:widowControl w:val="0"/>
-        <w:jc w:val="center"/>
-        <w:rPr>
-          <w:rFonts w:ascii="Garamond" w:cs="Garamond" w:eastAsia="Garamond" w:hAnsi="Garamond"/>
-          <w:b w:val="1"/>
-          <w:bCs w:val="1"/>
-          <w:sz w:val="24"/>
-          <w:szCs w:val="24"/>
-        </w:rPr>
-      </w:pPr>
-      <w:r>
-        <w:rPr>
-          <w:rFonts w:ascii="Garamond" w:cs="Garamond" w:eastAsia="Garamond" w:hAnsi="Garamond"/>
-          <w:b w:val="1"/>
-          <w:bCs w:val="1"/>
-          <w:sz w:val="24"/>
-          <w:szCs w:val="24"/>
-          <w:rtl w:val="0"/>
-        </w:rPr>
-        <w:t xml:space="preserve">Denied Rest Breaks: {{restbreakshifts}} shifts at ${{payrate}}/shift = ${{restbreak_total}}</w:t>
-      </w:r>
-    </w:p>
-    <w:p>
-      <w:pPr>
-        <w:widowControl w:val="0"/>
-        <w:jc w:val="center"/>
-        <w:rPr>
-          <w:rFonts w:ascii="Garamond" w:cs="Garamond" w:eastAsia="Garamond" w:hAnsi="Garamond"/>
-          <w:b w:val="1"/>
-          <w:bCs w:val="1"/>
-          <w:sz w:val="24"/>
-          <w:szCs w:val="24"/>
-        </w:rPr>
-      </w:pPr>
-      <w:r>
-        <w:rPr>
-          <w:rFonts w:ascii="Garamond" w:cs="Garamond" w:eastAsia="Garamond" w:hAnsi="Garamond"/>
-          <w:b w:val="1"/>
-          <w:bCs w:val="1"/>
-          <w:sz w:val="24"/>
-          <w:szCs w:val="24"/>
-          <w:rtl w:val="0"/>
-        </w:rPr>
-        <w:t xml:space="preserve">§ 210 Penalties: {{num_violations}} violations = ${{violations_total}}</w:t>
-      </w:r>
-    </w:p>
-    <w:p>
-      <w:pPr>
-        <w:widowControl w:val="0"/>
-        <w:jc w:val="center"/>
-        <w:rPr>
-          <w:rFonts w:ascii="Garamond" w:cs="Garamond" w:eastAsia="Garamond" w:hAnsi="Garamond"/>
-          <w:b w:val="1"/>
-          <w:bCs w:val="1"/>
-          <w:sz w:val="24"/>
-          <w:szCs w:val="24"/>
-        </w:rPr>
-      </w:pPr>
-      <w:r>
-        <w:rPr>
-          <w:rFonts w:ascii="Garamond" w:cs="Garamond" w:eastAsia="Garamond" w:hAnsi="Garamond"/>
-          <w:b w:val="1"/>
-          <w:bCs w:val="1"/>
-          <w:sz w:val="24"/>
-          <w:szCs w:val="24"/>
-          <w:rtl w:val="0"/>
-        </w:rPr>
-        <w:t xml:space="preserve">§ 210 Penalties: 25% of ${{penalties_sum}} = ${{violations_percent}}</w:t>
-      </w:r>
-    </w:p>
-    <w:p>
-      <w:pPr>
-        <w:widowControl w:val="0"/>
-        <w:jc w:val="center"/>
-        <w:rPr>
-          <w:rFonts w:ascii="Garamond" w:cs="Garamond" w:eastAsia="Garamond" w:hAnsi="Garamond"/>
-          <w:b w:val="1"/>
-          <w:bCs w:val="1"/>
-          <w:sz w:val="24"/>
-          <w:szCs w:val="24"/>
-        </w:rPr>
-      </w:pPr>
-      <w:r>
-        <w:rPr>
-          <w:rFonts w:ascii="Garamond" w:cs="Garamond" w:eastAsia="Garamond" w:hAnsi="Garamond"/>
-          <w:b w:val="1"/>
-          <w:bCs w:val="1"/>
-          <w:sz w:val="24"/>
-          <w:szCs w:val="24"/>
-          <w:rtl w:val="0"/>
-        </w:rPr>
-        <w:t xml:space="preserve">Inaccurate Wage Statements: {{num_violations}} Violations = ${{wage_total}}</w:t>
-      </w:r>
-    </w:p>
-    <w:p>
-      <w:pPr>
-        <w:widowControl w:val="0"/>
-        <w:jc w:val="center"/>
-        <w:rPr>
-          <w:rFonts w:ascii="Garamond" w:cs="Garamond" w:eastAsia="Garamond" w:hAnsi="Garamond"/>
-          <w:b w:val="1"/>
-          <w:bCs w:val="1"/>
-          <w:sz w:val="24"/>
-          <w:szCs w:val="24"/>
-        </w:rPr>
-      </w:pPr>
-      <w:r>
-        <w:rPr>
-          <w:rtl w:val="0"/>
-        </w:rPr>
-      </w:r>
-    </w:p>
-    <w:p>
-      <w:pPr>
-        <w:widowControl w:val="0"/>
-        <w:ind w:firstLine="960"/>
-        <w:jc w:val="both"/>
-        <w:rPr>
-          <w:rFonts w:ascii="Garamond" w:cs="Garamond" w:eastAsia="Garamond" w:hAnsi="Garamond"/>
-          <w:sz w:val="24"/>
-          <w:szCs w:val="24"/>
-        </w:rPr>
-      </w:pPr>
-      <w:r>
-        <w:rPr>
-          <w:rFonts w:ascii="Garamond" w:cs="Garamond" w:eastAsia="Garamond" w:hAnsi="Garamond"/>
-          <w:sz w:val="24"/>
-          <w:szCs w:val="24"/>
-          <w:rtl w:val="0"/>
-        </w:rPr>
-        <w:t xml:space="preserve">Importantly, {{title}} {{lastname}} would prefer to forego a protracted legal process in this matter. Instead, {{pronoun}} {{verb}} hopeful that this matter can be resolved quickly and amicably. To that end, {{title}} {{lastname}} will waive all claims against {{company}} in exchange for ${{demand_amount}} provided that you contact this office no later than {{atty_contact_date}}, to begin working toward resolving this matter. Should you fail to contact this office by that date, {{title}} {{lastname}} will seek {{possessive}} full wages, maximum penalties, and reasonable costs and attorney’s fees.</w:t>
-      </w:r>
-    </w:p>
-    <w:p>
-      <w:pPr>
+          <w:rtl w:val="0"/>
+        </w:rPr>
+      </w:r>
+    </w:p>
+    <w:p>
+      <w:pPr>
+        <w:keepNext w:val="0"/>
+        <w:keepLines w:val="0"/>
+        <w:pageBreakBefore w:val="0"/>
+        <w:widowControl w:val="1"/>
         <w:pBdr>
           <w:top w:space="0" w:sz="0" w:val="nil"/>
           <w:left w:space="0" w:sz="0" w:val="nil"/>
@@ -588,25 +242,785 @@
           <w:right w:space="0" w:sz="0" w:val="nil"/>
           <w:between w:space="0" w:sz="0" w:val="nil"/>
         </w:pBdr>
-        <w:spacing w:line="276" w:lineRule="auto"/>
+        <w:shd w:fill="auto" w:val="clear"/>
+        <w:spacing w:after="0" w:before="0" w:line="240" w:lineRule="auto"/>
+        <w:ind w:left="0" w:right="0" w:firstLine="960"/>
+        <w:jc w:val="both"/>
+        <w:rPr>
+          <w:rFonts w:ascii="Garamond" w:cs="Garamond" w:eastAsia="Garamond" w:hAnsi="Garamond"/>
+          <w:b w:val="0"/>
+          <w:bCs w:val="0"/>
+          <w:i w:val="0"/>
+          <w:iCs w:val="0"/>
+          <w:smallCaps w:val="0"/>
+          <w:strike w:val="0"/>
+          <w:color w:val="000000"/>
+          <w:sz w:val="24"/>
+          <w:szCs w:val="24"/>
+          <w:u w:val="none"/>
+          <w:shd w:fill="auto" w:val="clear"/>
+          <w:vertAlign w:val="baseline"/>
+        </w:rPr>
+      </w:pPr>
+      <w:r>
+        <w:rPr>
+          <w:rFonts w:ascii="Garamond" w:cs="Garamond" w:eastAsia="Garamond" w:hAnsi="Garamond"/>
+          <w:b w:val="0"/>
+          <w:bCs w:val="0"/>
+          <w:i w:val="0"/>
+          <w:iCs w:val="0"/>
+          <w:smallCaps w:val="0"/>
+          <w:strike w:val="0"/>
+          <w:color w:val="000000"/>
+          <w:sz w:val="24"/>
+          <w:szCs w:val="24"/>
+          <w:u w:val="none"/>
+          <w:shd w:fill="auto" w:val="clear"/>
+          <w:vertAlign w:val="baseline"/>
+          <w:rtl w:val="0"/>
+        </w:rPr>
+        <w:t xml:space="preserve">Over the course of </w:t>
+      </w:r>
+      <w:r>
+        <w:rPr>
+          <w:rFonts w:ascii="Garamond" w:cs="Garamond" w:eastAsia="Garamond" w:hAnsi="Garamond"/>
+          <w:sz w:val="24"/>
+          <w:szCs w:val="24"/>
+          <w:rtl w:val="0"/>
+        </w:rPr>
+        <w:t xml:space="preserve">{{possessive}}</w:t>
+      </w:r>
+      <w:r>
+        <w:rPr>
+          <w:rFonts w:ascii="Garamond" w:cs="Garamond" w:eastAsia="Garamond" w:hAnsi="Garamond"/>
+          <w:b w:val="0"/>
+          <w:bCs w:val="0"/>
+          <w:i w:val="0"/>
+          <w:iCs w:val="0"/>
+          <w:smallCaps w:val="0"/>
+          <w:strike w:val="0"/>
+          <w:color w:val="000000"/>
+          <w:sz w:val="24"/>
+          <w:szCs w:val="24"/>
+          <w:u w:val="none"/>
+          <w:shd w:fill="auto" w:val="clear"/>
+          <w:vertAlign w:val="baseline"/>
+          <w:rtl w:val="0"/>
+        </w:rPr>
+        <w:t xml:space="preserve"> employment, </w:t>
+      </w:r>
+      <w:r>
+        <w:rPr>
+          <w:rFonts w:ascii="Garamond" w:cs="Garamond" w:eastAsia="Garamond" w:hAnsi="Garamond"/>
+          <w:sz w:val="24"/>
+          <w:szCs w:val="24"/>
+          <w:rtl w:val="0"/>
+        </w:rPr>
+        <w:t xml:space="preserve">{{title}} {{lastname}}</w:t>
+      </w:r>
+      <w:r>
+        <w:rPr>
+          <w:rFonts w:ascii="Garamond" w:cs="Garamond" w:eastAsia="Garamond" w:hAnsi="Garamond"/>
+          <w:b w:val="0"/>
+          <w:bCs w:val="0"/>
+          <w:i w:val="0"/>
+          <w:iCs w:val="0"/>
+          <w:smallCaps w:val="0"/>
+          <w:strike w:val="0"/>
+          <w:color w:val="000000"/>
+          <w:sz w:val="24"/>
+          <w:szCs w:val="24"/>
+          <w:u w:val="none"/>
+          <w:shd w:fill="auto" w:val="clear"/>
+          <w:vertAlign w:val="baseline"/>
+          <w:rtl w:val="0"/>
+        </w:rPr>
+        <w:t xml:space="preserve"> has been working </w:t>
+      </w:r>
+      <w:r>
+        <w:rPr>
+          <w:rFonts w:ascii="Garamond" w:cs="Garamond" w:eastAsia="Garamond" w:hAnsi="Garamond"/>
+          <w:sz w:val="24"/>
+          <w:szCs w:val="24"/>
+          <w:rtl w:val="0"/>
+        </w:rPr>
+        <w:t xml:space="preserve">{{workinghours}}</w:t>
+      </w:r>
+      <w:r>
+        <w:rPr>
+          <w:rFonts w:ascii="Garamond" w:cs="Garamond" w:eastAsia="Garamond" w:hAnsi="Garamond"/>
+          <w:b w:val="0"/>
+          <w:bCs w:val="0"/>
+          <w:i w:val="0"/>
+          <w:iCs w:val="0"/>
+          <w:smallCaps w:val="0"/>
+          <w:strike w:val="0"/>
+          <w:color w:val="000000"/>
+          <w:sz w:val="24"/>
+          <w:szCs w:val="24"/>
+          <w:u w:val="none"/>
+          <w:shd w:fill="auto" w:val="clear"/>
+          <w:vertAlign w:val="baseline"/>
+          <w:rtl w:val="0"/>
+        </w:rPr>
+        <w:t xml:space="preserve"> hours per day, </w:t>
+      </w:r>
+      <w:r>
+        <w:rPr>
+          <w:rFonts w:ascii="Garamond" w:cs="Garamond" w:eastAsia="Garamond" w:hAnsi="Garamond"/>
+          <w:sz w:val="24"/>
+          <w:szCs w:val="24"/>
+          <w:rtl w:val="0"/>
+        </w:rPr>
+        <w:t xml:space="preserve">{{workingdays}}</w:t>
+      </w:r>
+      <w:r>
+        <w:rPr>
+          <w:rFonts w:ascii="Garamond" w:cs="Garamond" w:eastAsia="Garamond" w:hAnsi="Garamond"/>
+          <w:b w:val="0"/>
+          <w:bCs w:val="0"/>
+          <w:i w:val="0"/>
+          <w:iCs w:val="0"/>
+          <w:smallCaps w:val="0"/>
+          <w:strike w:val="0"/>
+          <w:color w:val="000000"/>
+          <w:sz w:val="24"/>
+          <w:szCs w:val="24"/>
+          <w:u w:val="none"/>
+          <w:shd w:fill="auto" w:val="clear"/>
+          <w:vertAlign w:val="baseline"/>
+          <w:rtl w:val="0"/>
+        </w:rPr>
+        <w:t xml:space="preserve"> days per week. Accordingly, for each shift that </w:t>
+      </w:r>
+      <w:r>
+        <w:rPr>
+          <w:rFonts w:ascii="Garamond" w:cs="Garamond" w:eastAsia="Garamond" w:hAnsi="Garamond"/>
+          <w:sz w:val="24"/>
+          <w:szCs w:val="24"/>
+          <w:rtl w:val="0"/>
+        </w:rPr>
+        <w:t xml:space="preserve">{{title}} {{lastname}}</w:t>
+      </w:r>
+      <w:r>
+        <w:rPr>
+          <w:rFonts w:ascii="Garamond" w:cs="Garamond" w:eastAsia="Garamond" w:hAnsi="Garamond"/>
+          <w:b w:val="0"/>
+          <w:bCs w:val="0"/>
+          <w:i w:val="0"/>
+          <w:iCs w:val="0"/>
+          <w:smallCaps w:val="0"/>
+          <w:strike w:val="0"/>
+          <w:color w:val="000000"/>
+          <w:sz w:val="24"/>
+          <w:szCs w:val="24"/>
+          <w:u w:val="none"/>
+          <w:shd w:fill="auto" w:val="clear"/>
+          <w:vertAlign w:val="baseline"/>
+          <w:rtl w:val="0"/>
+        </w:rPr>
+        <w:t xml:space="preserve"> worked, </w:t>
+      </w:r>
+      <w:r>
+        <w:rPr>
+          <w:rFonts w:ascii="Garamond" w:cs="Garamond" w:eastAsia="Garamond" w:hAnsi="Garamond"/>
+          <w:sz w:val="24"/>
+          <w:szCs w:val="24"/>
+          <w:rtl w:val="0"/>
+        </w:rPr>
+        <w:t xml:space="preserve">{{pronoun}}</w:t>
+      </w:r>
+      <w:r>
+        <w:rPr>
+          <w:rFonts w:ascii="Garamond" w:cs="Garamond" w:eastAsia="Garamond" w:hAnsi="Garamond"/>
+          <w:b w:val="0"/>
+          <w:bCs w:val="0"/>
+          <w:i w:val="0"/>
+          <w:iCs w:val="0"/>
+          <w:smallCaps w:val="0"/>
+          <w:strike w:val="0"/>
+          <w:color w:val="000000"/>
+          <w:sz w:val="24"/>
+          <w:szCs w:val="24"/>
+          <w:u w:val="none"/>
+          <w:shd w:fill="auto" w:val="clear"/>
+          <w:vertAlign w:val="baseline"/>
+          <w:rtl w:val="0"/>
+        </w:rPr>
+        <w:t xml:space="preserve"> </w:t>
+      </w:r>
+      <w:r>
+        <w:rPr>
+          <w:rFonts w:ascii="Garamond" w:cs="Garamond" w:eastAsia="Garamond" w:hAnsi="Garamond"/>
+          <w:sz w:val="24"/>
+          <w:szCs w:val="24"/>
+          <w:rtl w:val="0"/>
+        </w:rPr>
+        <w:t xml:space="preserve">{{verb}}</w:t>
+      </w:r>
+      <w:r>
+        <w:rPr>
+          <w:rFonts w:ascii="Garamond" w:cs="Garamond" w:eastAsia="Garamond" w:hAnsi="Garamond"/>
+          <w:b w:val="0"/>
+          <w:bCs w:val="0"/>
+          <w:i w:val="0"/>
+          <w:iCs w:val="0"/>
+          <w:smallCaps w:val="0"/>
+          <w:strike w:val="0"/>
+          <w:color w:val="000000"/>
+          <w:sz w:val="24"/>
+          <w:szCs w:val="24"/>
+          <w:u w:val="none"/>
+          <w:shd w:fill="auto" w:val="clear"/>
+          <w:vertAlign w:val="baseline"/>
+          <w:rtl w:val="0"/>
+        </w:rPr>
+        <w:t xml:space="preserve"> entitled to one meal break and two rest breaks. However, </w:t>
+      </w:r>
+      <w:r>
+        <w:rPr>
+          <w:rFonts w:ascii="Garamond" w:cs="Garamond" w:eastAsia="Garamond" w:hAnsi="Garamond"/>
+          <w:sz w:val="24"/>
+          <w:szCs w:val="24"/>
+          <w:rtl w:val="0"/>
+        </w:rPr>
+        <w:t xml:space="preserve">throughout {{possessive}} employment</w:t>
+      </w:r>
+      <w:r>
+        <w:rPr>
+          <w:rFonts w:ascii="Garamond" w:cs="Garamond" w:eastAsia="Garamond" w:hAnsi="Garamond"/>
+          <w:b w:val="0"/>
+          <w:bCs w:val="0"/>
+          <w:i w:val="0"/>
+          <w:iCs w:val="0"/>
+          <w:smallCaps w:val="0"/>
+          <w:strike w:val="0"/>
+          <w:color w:val="000000"/>
+          <w:sz w:val="24"/>
+          <w:szCs w:val="24"/>
+          <w:u w:val="none"/>
+          <w:shd w:fill="auto" w:val="clear"/>
+          <w:vertAlign w:val="baseline"/>
+          <w:rtl w:val="0"/>
+        </w:rPr>
+        <w:t xml:space="preserve">, </w:t>
+      </w:r>
+      <w:r>
+        <w:rPr>
+          <w:rFonts w:ascii="Garamond" w:cs="Garamond" w:eastAsia="Garamond" w:hAnsi="Garamond"/>
+          <w:sz w:val="24"/>
+          <w:szCs w:val="24"/>
+          <w:rtl w:val="0"/>
+        </w:rPr>
+        <w:t xml:space="preserve">{{title}} {{lastname}}</w:t>
+      </w:r>
+      <w:r>
+        <w:rPr>
+          <w:rFonts w:ascii="Garamond" w:cs="Garamond" w:eastAsia="Garamond" w:hAnsi="Garamond"/>
+          <w:b w:val="0"/>
+          <w:bCs w:val="0"/>
+          <w:i w:val="0"/>
+          <w:iCs w:val="0"/>
+          <w:smallCaps w:val="0"/>
+          <w:strike w:val="0"/>
+          <w:color w:val="000000"/>
+          <w:sz w:val="24"/>
+          <w:szCs w:val="24"/>
+          <w:u w:val="none"/>
+          <w:shd w:fill="auto" w:val="clear"/>
+          <w:vertAlign w:val="baseline"/>
+          <w:rtl w:val="0"/>
+        </w:rPr>
+        <w:t xml:space="preserve"> was denied both </w:t>
+      </w:r>
+      <w:r>
+        <w:rPr>
+          <w:rFonts w:ascii="Garamond" w:cs="Garamond" w:eastAsia="Garamond" w:hAnsi="Garamond"/>
+          <w:sz w:val="24"/>
+          <w:szCs w:val="24"/>
+          <w:rtl w:val="0"/>
+        </w:rPr>
+        <w:t xml:space="preserve">{{possessive}}</w:t>
+      </w:r>
+      <w:r>
+        <w:rPr>
+          <w:rFonts w:ascii="Garamond" w:cs="Garamond" w:eastAsia="Garamond" w:hAnsi="Garamond"/>
+          <w:b w:val="0"/>
+          <w:bCs w:val="0"/>
+          <w:i w:val="0"/>
+          <w:iCs w:val="0"/>
+          <w:smallCaps w:val="0"/>
+          <w:strike w:val="0"/>
+          <w:color w:val="000000"/>
+          <w:sz w:val="24"/>
+          <w:szCs w:val="24"/>
+          <w:u w:val="none"/>
+          <w:shd w:fill="auto" w:val="clear"/>
+          <w:vertAlign w:val="baseline"/>
+          <w:rtl w:val="0"/>
+        </w:rPr>
+        <w:t xml:space="preserve"> </w:t>
+      </w:r>
+      <w:r>
+        <w:rPr>
+          <w:rFonts w:ascii="Garamond" w:cs="Garamond" w:eastAsia="Garamond" w:hAnsi="Garamond"/>
+          <w:sz w:val="24"/>
+          <w:szCs w:val="24"/>
+          <w:rtl w:val="0"/>
+        </w:rPr>
+        <w:t xml:space="preserve">{{custom_sentence2}}</w:t>
+      </w:r>
+      <w:r>
+        <w:rPr>
+          <w:rFonts w:ascii="Garamond" w:cs="Garamond" w:eastAsia="Garamond" w:hAnsi="Garamond"/>
+          <w:b w:val="0"/>
+          <w:bCs w:val="0"/>
+          <w:i w:val="0"/>
+          <w:iCs w:val="0"/>
+          <w:smallCaps w:val="0"/>
+          <w:strike w:val="0"/>
+          <w:color w:val="000000"/>
+          <w:sz w:val="24"/>
+          <w:szCs w:val="24"/>
+          <w:u w:val="none"/>
+          <w:shd w:fill="auto" w:val="clear"/>
+          <w:vertAlign w:val="baseline"/>
+          <w:rtl w:val="0"/>
+        </w:rPr>
+        <w:t xml:space="preserve">.</w:t>
+      </w:r>
+      <w:r>
+        <w:rPr>
+          <w:rFonts w:ascii="Garamond" w:cs="Garamond" w:eastAsia="Garamond" w:hAnsi="Garamond"/>
+          <w:sz w:val="24"/>
+          <w:szCs w:val="24"/>
+          <w:rtl w:val="0"/>
+        </w:rPr>
+        <w:t xml:space="preserve"> {{title}} {{lastname}}</w:t>
+      </w:r>
+      <w:r>
+        <w:rPr>
+          <w:rFonts w:ascii="Garamond" w:cs="Garamond" w:eastAsia="Garamond" w:hAnsi="Garamond"/>
+          <w:b w:val="0"/>
+          <w:bCs w:val="0"/>
+          <w:i w:val="0"/>
+          <w:iCs w:val="0"/>
+          <w:smallCaps w:val="0"/>
+          <w:strike w:val="0"/>
+          <w:color w:val="000000"/>
+          <w:sz w:val="24"/>
+          <w:szCs w:val="24"/>
+          <w:u w:val="none"/>
+          <w:shd w:fill="auto" w:val="clear"/>
+          <w:vertAlign w:val="baseline"/>
+          <w:rtl w:val="0"/>
+        </w:rPr>
+        <w:t xml:space="preserve">, therefore, demanding payment of </w:t>
+      </w:r>
+      <w:r>
+        <w:rPr>
+          <w:rFonts w:ascii="Garamond" w:cs="Garamond" w:eastAsia="Garamond" w:hAnsi="Garamond"/>
+          <w:sz w:val="24"/>
+          <w:szCs w:val="24"/>
+          <w:rtl w:val="0"/>
+        </w:rPr>
+        <w:t xml:space="preserve">{{possessive}}</w:t>
+      </w:r>
+      <w:r>
+        <w:rPr>
+          <w:rFonts w:ascii="Garamond" w:cs="Garamond" w:eastAsia="Garamond" w:hAnsi="Garamond"/>
+          <w:b w:val="0"/>
+          <w:bCs w:val="0"/>
+          <w:i w:val="0"/>
+          <w:iCs w:val="0"/>
+          <w:smallCaps w:val="0"/>
+          <w:strike w:val="0"/>
+          <w:color w:val="000000"/>
+          <w:sz w:val="24"/>
+          <w:szCs w:val="24"/>
+          <w:u w:val="none"/>
+          <w:shd w:fill="auto" w:val="clear"/>
+          <w:vertAlign w:val="baseline"/>
+          <w:rtl w:val="0"/>
+        </w:rPr>
+        <w:t xml:space="preserve"> full wages and associated penalties.</w:t>
+      </w:r>
+    </w:p>
+    <w:p>
+      <w:pPr>
+        <w:widowControl w:val="0"/>
+        <w:ind w:firstLine="960"/>
+        <w:jc w:val="both"/>
+        <w:rPr>
+          <w:rFonts w:ascii="Garamond" w:cs="Garamond" w:eastAsia="Garamond" w:hAnsi="Garamond"/>
+          <w:sz w:val="24"/>
+          <w:szCs w:val="24"/>
+        </w:rPr>
+      </w:pPr>
+      <w:r>
+        <w:rPr>
+          <w:rtl w:val="0"/>
+        </w:rPr>
+      </w:r>
+    </w:p>
+    <w:p>
+      <w:pPr>
+        <w:widowControl w:val="0"/>
+        <w:ind w:firstLine="960"/>
+        <w:jc w:val="both"/>
+        <w:rPr>
+          <w:rFonts w:ascii="Garamond" w:cs="Garamond" w:eastAsia="Garamond" w:hAnsi="Garamond"/>
+          <w:sz w:val="24"/>
+          <w:szCs w:val="24"/>
+        </w:rPr>
+      </w:pPr>
+      <w:r>
+        <w:rPr>
+          <w:rFonts w:ascii="Garamond" w:cs="Garamond" w:eastAsia="Garamond" w:hAnsi="Garamond"/>
+          <w:sz w:val="24"/>
+          <w:szCs w:val="24"/>
+          <w:rtl w:val="0"/>
+        </w:rPr>
+        <w:t xml:space="preserve">California Labor Code section 204 provides that payment for all wages earned by an employee during the course of {{possessive}} employment are due and payable twice each calendar month. An employer’s failure to pay wages results in a penalty of $100 for the first violation and $200 for each additional violation, plus 25% of the amount unlawfully withheld.  (Cal. Labor Code § 210.) Additionally, California Labor Code section 226(a) requires employers to furnish their employees with accurate itemized statements showing the total hours worked by the employee for each pay period.  Any failure to accurately furnish this information renders the employer liable for actual damages, or $50.00 for the first violation and $100.00 for each additional violation, whichever is greater.  Finally, Mr. Simcox is entitled to recover reasonable costs and attorney’s fees. (Cal. Labor Code § 218.5.)</w:t>
+      </w:r>
+    </w:p>
+    <w:p>
+      <w:pPr>
+        <w:widowControl w:val="0"/>
+        <w:ind w:firstLine="960"/>
+        <w:jc w:val="both"/>
+        <w:rPr>
+          <w:rFonts w:ascii="Garamond" w:cs="Garamond" w:eastAsia="Garamond" w:hAnsi="Garamond"/>
+          <w:sz w:val="24"/>
+          <w:szCs w:val="24"/>
+        </w:rPr>
+      </w:pPr>
+      <w:r>
+        <w:rPr>
+          <w:rtl w:val="0"/>
+        </w:rPr>
+      </w:r>
+    </w:p>
+    <w:p>
+      <w:pPr>
+        <w:widowControl w:val="0"/>
+        <w:ind w:firstLine="960"/>
+        <w:jc w:val="both"/>
+        <w:rPr>
+          <w:rFonts w:ascii="Garamond" w:cs="Garamond" w:eastAsia="Garamond" w:hAnsi="Garamond"/>
+          <w:sz w:val="24"/>
+          <w:szCs w:val="24"/>
+        </w:rPr>
+      </w:pPr>
+      <w:r>
+        <w:rPr>
+          <w:rFonts w:ascii="Garamond" w:cs="Garamond" w:eastAsia="Garamond" w:hAnsi="Garamond"/>
+          <w:sz w:val="24"/>
+          <w:szCs w:val="24"/>
+          <w:rtl w:val="0"/>
+        </w:rPr>
+        <w:t xml:space="preserve">The California Supreme Court in </w:t>
+      </w:r>
+      <w:r>
+        <w:rPr>
+          <w:rFonts w:ascii="Garamond" w:cs="Garamond" w:eastAsia="Garamond" w:hAnsi="Garamond"/>
+          <w:i w:val="1"/>
+          <w:iCs w:val="1"/>
+          <w:sz w:val="24"/>
+          <w:szCs w:val="24"/>
+          <w:rtl w:val="0"/>
+        </w:rPr>
+        <w:t xml:space="preserve">Naranjo v. Spectrum Security Services, Inc.</w:t>
+      </w:r>
+      <w:r>
+        <w:rPr>
+          <w:rFonts w:ascii="Garamond" w:cs="Garamond" w:eastAsia="Garamond" w:hAnsi="Garamond"/>
+          <w:sz w:val="24"/>
+          <w:szCs w:val="24"/>
+          <w:rtl w:val="0"/>
+        </w:rPr>
+        <w:t xml:space="preserve"> determined that unpaid break premiums constitute wages that can trigger derivative wage claims penalties. California Labor Code §512 requires an employer to give an employee a 30 minute meal break if the employee works in excess of six hours. Additionally, Industrial Welfare Commission Order No. 5-2001 (12A) requires that an employer provide its employee with a ten minute break for rest time for every four hours worked, or significant fraction thereof. California Labor Code §226.7 provides that the “employer shall pay the employee one additional hour of pay at the employee’s regular rate of compensation for each workday that the meal or rest or recovery period is not provided,” which is capped at one meal break and one rest break penalty per day.  (</w:t>
+      </w:r>
+      <w:r>
+        <w:rPr>
+          <w:rFonts w:ascii="Garamond" w:cs="Garamond" w:eastAsia="Garamond" w:hAnsi="Garamond"/>
+          <w:i w:val="1"/>
+          <w:iCs w:val="1"/>
+          <w:sz w:val="24"/>
+          <w:szCs w:val="24"/>
+          <w:rtl w:val="0"/>
+        </w:rPr>
+        <w:t xml:space="preserve">Marlo v. United Parcel Service, Inc.</w:t>
+      </w:r>
+      <w:r>
+        <w:rPr>
+          <w:rFonts w:ascii="Garamond" w:cs="Garamond" w:eastAsia="Garamond" w:hAnsi="Garamond"/>
+          <w:sz w:val="24"/>
+          <w:szCs w:val="24"/>
+          <w:rtl w:val="0"/>
+        </w:rPr>
+        <w:t xml:space="preserve"> (2011) 639 F. 3d 942.)</w:t>
+      </w:r>
+    </w:p>
+    <w:p>
+      <w:pPr>
+        <w:widowControl w:val="0"/>
+        <w:ind w:firstLine="960"/>
+        <w:jc w:val="both"/>
+        <w:rPr>
+          <w:rFonts w:ascii="Garamond" w:cs="Garamond" w:eastAsia="Garamond" w:hAnsi="Garamond"/>
+          <w:sz w:val="24"/>
+          <w:szCs w:val="24"/>
+        </w:rPr>
+      </w:pPr>
+      <w:r>
+        <w:rPr>
+          <w:rtl w:val="0"/>
+        </w:rPr>
+      </w:r>
+    </w:p>
+    <w:p>
+      <w:pPr>
+        <w:widowControl w:val="0"/>
+        <w:ind w:firstLine="960"/>
+        <w:jc w:val="both"/>
+        <w:rPr>
+          <w:rFonts w:ascii="Garamond" w:cs="Garamond" w:eastAsia="Garamond" w:hAnsi="Garamond"/>
+          <w:sz w:val="24"/>
+          <w:szCs w:val="24"/>
+        </w:rPr>
+      </w:pPr>
+      <w:r>
+        <w:rPr>
+          <w:rFonts w:ascii="Garamond" w:cs="Garamond" w:eastAsia="Garamond" w:hAnsi="Garamond"/>
+          <w:sz w:val="24"/>
+          <w:szCs w:val="24"/>
+          <w:rtl w:val="0"/>
+        </w:rPr>
+        <w:t xml:space="preserve">{{title}} {{lastname}} is a Full-time employee at {{company}} and works an average of {{workinghours}} hours per scheduled shift. Moreover, {{possessive}} rate of pay is ${{payrate}} per labor hour. Accordingly, {{company}} is liable to {{title}} {{lastname}} in the amount of ${{total_sum}}, excluding costs and fees, as detailed below:</w:t>
+      </w:r>
+    </w:p>
+    <w:p>
+      <w:pPr>
+        <w:widowControl w:val="0"/>
         <w:jc w:val="center"/>
         <w:rPr>
           <w:rFonts w:ascii="Garamond" w:cs="Garamond" w:eastAsia="Garamond" w:hAnsi="Garamond"/>
           <w:b w:val="1"/>
           <w:bCs w:val="1"/>
-          <w:color w:val="000000"/>
-          <w:sz w:val="24"/>
-          <w:szCs w:val="24"/>
-        </w:rPr>
-      </w:pPr>
-      <w:r>
-        <w:rPr>
-          <w:rtl w:val="0"/>
-        </w:rPr>
-      </w:r>
-    </w:p>
-    <w:p>
-      <w:pPr>
+          <w:sz w:val="24"/>
+          <w:szCs w:val="24"/>
+        </w:rPr>
+      </w:pPr>
+      <w:r>
+        <w:rPr>
+          <w:rtl w:val="0"/>
+        </w:rPr>
+      </w:r>
+    </w:p>
+    <w:p>
+      <w:pPr>
+        <w:widowControl w:val="0"/>
+        <w:jc w:val="center"/>
+        <w:rPr>
+          <w:rFonts w:ascii="Garamond" w:cs="Garamond" w:eastAsia="Garamond" w:hAnsi="Garamond"/>
+          <w:b w:val="1"/>
+          <w:bCs w:val="1"/>
+          <w:sz w:val="24"/>
+          <w:szCs w:val="24"/>
+        </w:rPr>
+      </w:pPr>
+      <w:r>
+        <w:rPr>
+          <w:rFonts w:ascii="Garamond" w:cs="Garamond" w:eastAsia="Garamond" w:hAnsi="Garamond"/>
+          <w:b w:val="1"/>
+          <w:bCs w:val="1"/>
+          <w:sz w:val="24"/>
+          <w:szCs w:val="24"/>
+          <w:rtl w:val="0"/>
+        </w:rPr>
+        <w:t xml:space="preserve">Denied Rest Breaks: {{restbreakshifts}} shifts at ${{payrate}}/shift = ${{restbreak_total}}</w:t>
+      </w:r>
+    </w:p>
+    <w:p>
+      <w:pPr>
+        <w:widowControl w:val="0"/>
+        <w:jc w:val="center"/>
+        <w:rPr>
+          <w:rFonts w:ascii="Garamond" w:cs="Garamond" w:eastAsia="Garamond" w:hAnsi="Garamond"/>
+          <w:b w:val="1"/>
+          <w:bCs w:val="1"/>
+          <w:sz w:val="24"/>
+          <w:szCs w:val="24"/>
+        </w:rPr>
+      </w:pPr>
+      <w:r>
+        <w:rPr>
+          <w:rFonts w:ascii="Garamond" w:cs="Garamond" w:eastAsia="Garamond" w:hAnsi="Garamond"/>
+          <w:b w:val="1"/>
+          <w:bCs w:val="1"/>
+          <w:sz w:val="24"/>
+          <w:szCs w:val="24"/>
+          <w:rtl w:val="0"/>
+        </w:rPr>
+        <w:t xml:space="preserve">Denied Meal Breaks: {{mealbreakshifts}} shifts at ${{payrate}}/shift = ${{mealbreak_total}}</w:t>
+      </w:r>
+    </w:p>
+    <w:p>
+      <w:pPr>
+        <w:widowControl w:val="0"/>
+        <w:jc w:val="center"/>
+        <w:rPr>
+          <w:rFonts w:ascii="Garamond" w:cs="Garamond" w:eastAsia="Garamond" w:hAnsi="Garamond"/>
+          <w:b w:val="1"/>
+          <w:bCs w:val="1"/>
+          <w:sz w:val="24"/>
+          <w:szCs w:val="24"/>
+        </w:rPr>
+      </w:pPr>
+      <w:r>
+        <w:rPr>
+          <w:rFonts w:ascii="Garamond" w:cs="Garamond" w:eastAsia="Garamond" w:hAnsi="Garamond"/>
+          <w:b w:val="1"/>
+          <w:bCs w:val="1"/>
+          <w:sz w:val="24"/>
+          <w:szCs w:val="24"/>
+          <w:rtl w:val="0"/>
+        </w:rPr>
+        <w:t xml:space="preserve">§ 210</w:t>
+      </w:r>
+      <w:r>
+        <w:rPr>
+          <w:rFonts w:ascii="Garamond" w:cs="Garamond" w:eastAsia="Garamond" w:hAnsi="Garamond"/>
+          <w:sz w:val="24"/>
+          <w:szCs w:val="24"/>
+          <w:rtl w:val="0"/>
+        </w:rPr>
+        <w:t xml:space="preserve"> </w:t>
+      </w:r>
+      <w:r>
+        <w:rPr>
+          <w:rFonts w:ascii="Garamond" w:cs="Garamond" w:eastAsia="Garamond" w:hAnsi="Garamond"/>
+          <w:b w:val="1"/>
+          <w:bCs w:val="1"/>
+          <w:sz w:val="24"/>
+          <w:szCs w:val="24"/>
+          <w:rtl w:val="0"/>
+        </w:rPr>
+        <w:t xml:space="preserve">Penalties: {{num_violations}} violations = ${{violations_total}}</w:t>
+      </w:r>
+    </w:p>
+    <w:p>
+      <w:pPr>
+        <w:widowControl w:val="0"/>
+        <w:jc w:val="center"/>
+        <w:rPr>
+          <w:rFonts w:ascii="Garamond" w:cs="Garamond" w:eastAsia="Garamond" w:hAnsi="Garamond"/>
+          <w:b w:val="1"/>
+          <w:bCs w:val="1"/>
+          <w:sz w:val="24"/>
+          <w:szCs w:val="24"/>
+        </w:rPr>
+      </w:pPr>
+      <w:r>
+        <w:rPr>
+          <w:rFonts w:ascii="Garamond" w:cs="Garamond" w:eastAsia="Garamond" w:hAnsi="Garamond"/>
+          <w:b w:val="1"/>
+          <w:bCs w:val="1"/>
+          <w:sz w:val="24"/>
+          <w:szCs w:val="24"/>
+          <w:rtl w:val="0"/>
+        </w:rPr>
+        <w:t xml:space="preserve">§ 210</w:t>
+      </w:r>
+      <w:r>
+        <w:rPr>
+          <w:rFonts w:ascii="Garamond" w:cs="Garamond" w:eastAsia="Garamond" w:hAnsi="Garamond"/>
+          <w:sz w:val="24"/>
+          <w:szCs w:val="24"/>
+          <w:rtl w:val="0"/>
+        </w:rPr>
+        <w:t xml:space="preserve"> </w:t>
+      </w:r>
+      <w:r>
+        <w:rPr>
+          <w:rFonts w:ascii="Garamond" w:cs="Garamond" w:eastAsia="Garamond" w:hAnsi="Garamond"/>
+          <w:b w:val="1"/>
+          <w:bCs w:val="1"/>
+          <w:sz w:val="24"/>
+          <w:szCs w:val="24"/>
+          <w:rtl w:val="0"/>
+        </w:rPr>
+        <w:t xml:space="preserve">Penalties: 25% of ${{penalties_sum}} = ${{violations_percent}}</w:t>
+      </w:r>
+    </w:p>
+    <w:p>
+      <w:pPr>
+        <w:widowControl w:val="0"/>
+        <w:jc w:val="center"/>
+        <w:rPr>
+          <w:rFonts w:ascii="Garamond" w:cs="Garamond" w:eastAsia="Garamond" w:hAnsi="Garamond"/>
+          <w:b w:val="1"/>
+          <w:bCs w:val="1"/>
+          <w:sz w:val="24"/>
+          <w:szCs w:val="24"/>
+        </w:rPr>
+      </w:pPr>
+      <w:r>
+        <w:rPr>
+          <w:rFonts w:ascii="Garamond" w:cs="Garamond" w:eastAsia="Garamond" w:hAnsi="Garamond"/>
+          <w:b w:val="1"/>
+          <w:bCs w:val="1"/>
+          <w:sz w:val="24"/>
+          <w:szCs w:val="24"/>
+          <w:rtl w:val="0"/>
+        </w:rPr>
+        <w:t xml:space="preserve">Inaccurate Wage Statements: {{num_violations}} violations = ${{wage_total}}</w:t>
+      </w:r>
+    </w:p>
+    <w:p>
+      <w:pPr>
+        <w:widowControl w:val="0"/>
+        <w:jc w:val="center"/>
+        <w:rPr>
+          <w:rFonts w:ascii="Garamond" w:cs="Garamond" w:eastAsia="Garamond" w:hAnsi="Garamond"/>
+          <w:sz w:val="24"/>
+          <w:szCs w:val="24"/>
+        </w:rPr>
+      </w:pPr>
+      <w:r>
+        <w:rPr>
+          <w:rtl w:val="0"/>
+        </w:rPr>
+      </w:r>
+    </w:p>
+    <w:p>
+      <w:pPr>
+        <w:widowControl w:val="0"/>
+        <w:ind w:firstLine="960"/>
+        <w:jc w:val="both"/>
+        <w:rPr>
+          <w:rFonts w:ascii="Garamond" w:cs="Garamond" w:eastAsia="Garamond" w:hAnsi="Garamond"/>
+          <w:sz w:val="24"/>
+          <w:szCs w:val="24"/>
+        </w:rPr>
+      </w:pPr>
+      <w:r>
+        <w:rPr>
+          <w:rFonts w:ascii="Garamond" w:cs="Garamond" w:eastAsia="Garamond" w:hAnsi="Garamond"/>
+          <w:sz w:val="24"/>
+          <w:szCs w:val="24"/>
+          <w:rtl w:val="0"/>
+        </w:rPr>
+        <w:t xml:space="preserve">Importantly, {{title}} {{lastname}} would prefer to forego a protracted legal process in this matter. Instead, {{pronoun}} {{verb}} hopeful that this matter can be resolved quickly and amicably. To that end, {{title}} {{lastname}} will waive all claims against {{company}} in exchange for ${{demand_amount}} provided that you contact this office no later than {{atty_contact_datee}}, 2024, to begin working toward resolving this matter. Should you fail to contact this office by that date, {{title}} {{lastname}} will seek {{possessive}} full wages, maximum penalties, and reasonable costs and attorney’s fees.</w:t>
+      </w:r>
+    </w:p>
+    <w:p>
+      <w:pPr>
+        <w:keepNext w:val="0"/>
+        <w:keepLines w:val="0"/>
+        <w:pageBreakBefore w:val="0"/>
+        <w:widowControl w:val="1"/>
         <w:pBdr>
           <w:top w:space="0" w:sz="0" w:val="nil"/>
           <w:left w:space="0" w:sz="0" w:val="nil"/>
@@ -614,25 +1028,80 @@
           <w:right w:space="0" w:sz="0" w:val="nil"/>
           <w:between w:space="0" w:sz="0" w:val="nil"/>
         </w:pBdr>
-        <w:spacing w:after="200" w:line="276" w:lineRule="auto"/>
+        <w:shd w:fill="auto" w:val="clear"/>
+        <w:spacing w:after="0" w:before="0" w:line="276" w:lineRule="auto"/>
+        <w:ind w:left="0" w:right="0" w:firstLine="0"/>
         <w:jc w:val="center"/>
         <w:rPr>
           <w:rFonts w:ascii="Garamond" w:cs="Garamond" w:eastAsia="Garamond" w:hAnsi="Garamond"/>
           <w:b w:val="1"/>
           <w:bCs w:val="1"/>
+          <w:i w:val="0"/>
+          <w:iCs w:val="0"/>
+          <w:smallCaps w:val="0"/>
+          <w:strike w:val="0"/>
           <w:color w:val="000000"/>
           <w:sz w:val="24"/>
           <w:szCs w:val="24"/>
-        </w:rPr>
-      </w:pPr>
-      <w:r>
+          <w:u w:val="none"/>
+          <w:shd w:fill="auto" w:val="clear"/>
+          <w:vertAlign w:val="baseline"/>
+        </w:rPr>
+      </w:pPr>
+      <w:r>
+        <w:rPr>
+          <w:rtl w:val="0"/>
+        </w:rPr>
+      </w:r>
+    </w:p>
+    <w:p>
+      <w:pPr>
+        <w:keepNext w:val="0"/>
+        <w:keepLines w:val="0"/>
+        <w:pageBreakBefore w:val="0"/>
+        <w:widowControl w:val="1"/>
+        <w:pBdr>
+          <w:top w:space="0" w:sz="0" w:val="nil"/>
+          <w:left w:space="0" w:sz="0" w:val="nil"/>
+          <w:bottom w:space="0" w:sz="0" w:val="nil"/>
+          <w:right w:space="0" w:sz="0" w:val="nil"/>
+          <w:between w:space="0" w:sz="0" w:val="nil"/>
+        </w:pBdr>
+        <w:shd w:fill="auto" w:val="clear"/>
+        <w:spacing w:after="200" w:before="0" w:line="276" w:lineRule="auto"/>
+        <w:ind w:left="0" w:right="0" w:firstLine="0"/>
+        <w:jc w:val="center"/>
         <w:rPr>
           <w:rFonts w:ascii="Garamond" w:cs="Garamond" w:eastAsia="Garamond" w:hAnsi="Garamond"/>
           <w:b w:val="1"/>
           <w:bCs w:val="1"/>
+          <w:i w:val="0"/>
+          <w:iCs w:val="0"/>
+          <w:smallCaps w:val="0"/>
+          <w:strike w:val="0"/>
           <w:color w:val="000000"/>
           <w:sz w:val="24"/>
           <w:szCs w:val="24"/>
+          <w:u w:val="none"/>
+          <w:shd w:fill="auto" w:val="clear"/>
+          <w:vertAlign w:val="baseline"/>
+        </w:rPr>
+      </w:pPr>
+      <w:r>
+        <w:rPr>
+          <w:rFonts w:ascii="Garamond" w:cs="Garamond" w:eastAsia="Garamond" w:hAnsi="Garamond"/>
+          <w:b w:val="1"/>
+          <w:bCs w:val="1"/>
+          <w:i w:val="0"/>
+          <w:iCs w:val="0"/>
+          <w:smallCaps w:val="0"/>
+          <w:strike w:val="0"/>
+          <w:color w:val="000000"/>
+          <w:sz w:val="24"/>
+          <w:szCs w:val="24"/>
+          <w:u w:val="none"/>
+          <w:shd w:fill="auto" w:val="clear"/>
+          <w:vertAlign w:val="baseline"/>
           <w:rtl w:val="0"/>
         </w:rPr>
         <w:t xml:space="preserve">FURTHER HANDLING</w:t>
@@ -833,7 +1302,7 @@
             <wp:extent cx="2731135" cy="330458"/>
             <wp:effectExtent b="0" l="0" r="0" t="0"/>
             <wp:wrapNone/>
-            <wp:docPr id="3" name="image1.png"/>
+            <wp:docPr id="2" name="image1.png"/>
             <a:graphic>
               <a:graphicData uri="http://schemas.openxmlformats.org/drawingml/2006/picture">
                 <pic:pic>
@@ -969,16 +1438,6 @@
         </w:rPr>
       </w:r>
     </w:p>
-    <w:p>
-      <w:pPr>
-        <w:rPr/>
-      </w:pPr>
-      <w:r>
-        <w:rPr>
-          <w:rtl w:val="0"/>
-        </w:rPr>
-      </w:r>
-    </w:p>
     <w:sectPr>
       <w:headerReference r:id="rId9" w:type="default"/>
       <w:headerReference r:id="rId10" w:type="first"/>
@@ -998,6 +1457,10 @@
 <w:ftr xmlns:mc="http://schemas.openxmlformats.org/markup-compatibility/2006" xmlns:o="urn:schemas-microsoft-com:office:office" xmlns:r="http://schemas.openxmlformats.org/officeDocument/2006/relationships" xmlns:m="http://schemas.openxmlformats.org/officeDocument/2006/math" xmlns:v="urn:schemas-microsoft-com:vml" xmlns:wp="http://schemas.openxmlformats.org/drawingml/2006/wordprocessingDrawing" xmlns:w10="urn:schemas-microsoft-com:office:word" xmlns:w="http://schemas.openxmlformats.org/wordprocessingml/2006/main" xmlns:wne="http://schemas.microsoft.com/office/word/2006/wordml" xmlns:sl="http://schemas.openxmlformats.org/schemaLibrary/2006/main" xmlns:a="http://schemas.openxmlformats.org/drawingml/2006/main" xmlns:pic="http://schemas.openxmlformats.org/drawingml/2006/picture" xmlns:c="http://schemas.openxmlformats.org/drawingml/2006/chart" xmlns:lc="http://schemas.openxmlformats.org/drawingml/2006/lockedCanvas" xmlns:dgm="http://schemas.openxmlformats.org/drawingml/2006/diagram" xmlns:wps="http://schemas.microsoft.com/office/word/2010/wordprocessingShape" xmlns:wpg="http://schemas.microsoft.com/office/word/2010/wordprocessingGroup" xmlns:w14="http://schemas.microsoft.com/office/word/2010/wordml" xmlns:w15="http://schemas.microsoft.com/office/word/2012/wordml" xmlns:w16="http://schemas.microsoft.com/office/word/2018/wordml" xmlns:w16cex="http://schemas.microsoft.com/office/word/2018/wordml/cex" xmlns:w16cid="http://schemas.microsoft.com/office/word/2016/wordml/cid" xmlns="http://schemas.microsoft.com/office/tasks/2019/documenttasks" xmlns:cr="http://schemas.microsoft.com/office/comments/2020/reactions">
   <w:p>
     <w:pPr>
+      <w:keepNext w:val="0"/>
+      <w:keepLines w:val="0"/>
+      <w:pageBreakBefore w:val="0"/>
+      <w:widowControl w:val="1"/>
       <w:pBdr>
         <w:top w:space="0" w:sz="0" w:val="nil"/>
         <w:left w:space="0" w:sz="0" w:val="nil"/>
@@ -1005,12 +1468,28 @@
         <w:right w:space="0" w:sz="0" w:val="nil"/>
         <w:between w:space="0" w:sz="0" w:val="nil"/>
       </w:pBdr>
+      <w:shd w:fill="auto" w:val="clear"/>
       <w:tabs>
         <w:tab w:val="center" w:leader="none" w:pos="4320"/>
         <w:tab w:val="right" w:leader="none" w:pos="8640"/>
       </w:tabs>
-      <w:rPr>
+      <w:spacing w:after="0" w:before="0" w:line="240" w:lineRule="auto"/>
+      <w:ind w:left="0" w:right="0" w:firstLine="0"/>
+      <w:jc w:val="left"/>
+      <w:rPr>
+        <w:rFonts w:ascii="Times New Roman" w:cs="Times New Roman" w:eastAsia="Times New Roman" w:hAnsi="Times New Roman"/>
+        <w:b w:val="0"/>
+        <w:bCs w:val="0"/>
+        <w:i w:val="0"/>
+        <w:iCs w:val="0"/>
+        <w:smallCaps w:val="0"/>
+        <w:strike w:val="0"/>
         <w:color w:val="000000"/>
+        <w:sz w:val="20"/>
+        <w:szCs w:val="20"/>
+        <w:u w:val="none"/>
+        <w:shd w:fill="auto" w:val="clear"/>
+        <w:vertAlign w:val="baseline"/>
       </w:rPr>
     </w:pPr>
     <w:r>
@@ -1026,6 +1505,10 @@
 <w:ftr xmlns:mc="http://schemas.openxmlformats.org/markup-compatibility/2006" xmlns:o="urn:schemas-microsoft-com:office:office" xmlns:r="http://schemas.openxmlformats.org/officeDocument/2006/relationships" xmlns:m="http://schemas.openxmlformats.org/officeDocument/2006/math" xmlns:v="urn:schemas-microsoft-com:vml" xmlns:wp="http://schemas.openxmlformats.org/drawingml/2006/wordprocessingDrawing" xmlns:w10="urn:schemas-microsoft-com:office:word" xmlns:w="http://schemas.openxmlformats.org/wordprocessingml/2006/main" xmlns:wne="http://schemas.microsoft.com/office/word/2006/wordml" xmlns:sl="http://schemas.openxmlformats.org/schemaLibrary/2006/main" xmlns:a="http://schemas.openxmlformats.org/drawingml/2006/main" xmlns:pic="http://schemas.openxmlformats.org/drawingml/2006/picture" xmlns:c="http://schemas.openxmlformats.org/drawingml/2006/chart" xmlns:lc="http://schemas.openxmlformats.org/drawingml/2006/lockedCanvas" xmlns:dgm="http://schemas.openxmlformats.org/drawingml/2006/diagram" xmlns:wps="http://schemas.microsoft.com/office/word/2010/wordprocessingShape" xmlns:wpg="http://schemas.microsoft.com/office/word/2010/wordprocessingGroup" xmlns:w14="http://schemas.microsoft.com/office/word/2010/wordml" xmlns:w15="http://schemas.microsoft.com/office/word/2012/wordml" xmlns:w16="http://schemas.microsoft.com/office/word/2018/wordml" xmlns:w16cex="http://schemas.microsoft.com/office/word/2018/wordml/cex" xmlns:w16cid="http://schemas.microsoft.com/office/word/2016/wordml/cid" xmlns="http://schemas.microsoft.com/office/tasks/2019/documenttasks" xmlns:cr="http://schemas.microsoft.com/office/comments/2020/reactions">
   <w:p>
     <w:pPr>
+      <w:keepNext w:val="0"/>
+      <w:keepLines w:val="0"/>
+      <w:pageBreakBefore w:val="0"/>
+      <w:widowControl w:val="1"/>
       <w:pBdr>
         <w:top w:space="0" w:sz="0" w:val="nil"/>
         <w:left w:space="0" w:sz="0" w:val="nil"/>
@@ -1033,21 +1516,45 @@
         <w:right w:space="0" w:sz="0" w:val="nil"/>
         <w:between w:space="0" w:sz="0" w:val="nil"/>
       </w:pBdr>
+      <w:shd w:fill="auto" w:val="clear"/>
       <w:tabs>
         <w:tab w:val="center" w:leader="none" w:pos="4320"/>
         <w:tab w:val="right" w:leader="none" w:pos="8640"/>
       </w:tabs>
+      <w:spacing w:after="0" w:before="0" w:line="240" w:lineRule="auto"/>
+      <w:ind w:left="0" w:right="0" w:firstLine="0"/>
       <w:jc w:val="center"/>
       <w:rPr>
+        <w:rFonts w:ascii="Times New Roman" w:cs="Times New Roman" w:eastAsia="Times New Roman" w:hAnsi="Times New Roman"/>
+        <w:b w:val="0"/>
+        <w:bCs w:val="0"/>
+        <w:i w:val="0"/>
+        <w:iCs w:val="0"/>
+        <w:smallCaps w:val="0"/>
+        <w:strike w:val="0"/>
         <w:color w:val="000000"/>
+        <w:sz w:val="20"/>
+        <w:szCs w:val="20"/>
+        <w:u w:val="none"/>
+        <w:shd w:fill="auto" w:val="clear"/>
+        <w:vertAlign w:val="baseline"/>
       </w:rPr>
     </w:pPr>
     <w:r>
       <w:rPr>
         <w:rFonts w:ascii="Calibri" w:cs="Calibri" w:eastAsia="Calibri" w:hAnsi="Calibri"/>
+        <w:b w:val="0"/>
+        <w:bCs w:val="0"/>
+        <w:i w:val="0"/>
+        <w:iCs w:val="0"/>
+        <w:smallCaps w:val="0"/>
+        <w:strike w:val="0"/>
         <w:color w:val="000000"/>
         <w:sz w:val="24"/>
         <w:szCs w:val="24"/>
+        <w:u w:val="none"/>
+        <w:shd w:fill="auto" w:val="clear"/>
+        <w:vertAlign w:val="baseline"/>
         <w:rtl w:val="0"/>
       </w:rPr>
       <w:t xml:space="preserve">Andrew Athanassious | (916) 587-1457 | legal@thelawguys.com</w:t>
@@ -1065,6 +1572,10 @@
 <w:ftr xmlns:mc="http://schemas.openxmlformats.org/markup-compatibility/2006" xmlns:o="urn:schemas-microsoft-com:office:office" xmlns:r="http://schemas.openxmlformats.org/officeDocument/2006/relationships" xmlns:m="http://schemas.openxmlformats.org/officeDocument/2006/math" xmlns:v="urn:schemas-microsoft-com:vml" xmlns:wp="http://schemas.openxmlformats.org/drawingml/2006/wordprocessingDrawing" xmlns:w10="urn:schemas-microsoft-com:office:word" xmlns:w="http://schemas.openxmlformats.org/wordprocessingml/2006/main" xmlns:wne="http://schemas.microsoft.com/office/word/2006/wordml" xmlns:sl="http://schemas.openxmlformats.org/schemaLibrary/2006/main" xmlns:a="http://schemas.openxmlformats.org/drawingml/2006/main" xmlns:pic="http://schemas.openxmlformats.org/drawingml/2006/picture" xmlns:c="http://schemas.openxmlformats.org/drawingml/2006/chart" xmlns:lc="http://schemas.openxmlformats.org/drawingml/2006/lockedCanvas" xmlns:dgm="http://schemas.openxmlformats.org/drawingml/2006/diagram" xmlns:wps="http://schemas.microsoft.com/office/word/2010/wordprocessingShape" xmlns:wpg="http://schemas.microsoft.com/office/word/2010/wordprocessingGroup" xmlns:w14="http://schemas.microsoft.com/office/word/2010/wordml" xmlns:w15="http://schemas.microsoft.com/office/word/2012/wordml" xmlns:w16="http://schemas.microsoft.com/office/word/2018/wordml" xmlns:w16cex="http://schemas.microsoft.com/office/word/2018/wordml/cex" xmlns:w16cid="http://schemas.microsoft.com/office/word/2016/wordml/cid" xmlns="http://schemas.microsoft.com/office/tasks/2019/documenttasks" xmlns:cr="http://schemas.microsoft.com/office/comments/2020/reactions">
   <w:p>
     <w:pPr>
+      <w:keepNext w:val="0"/>
+      <w:keepLines w:val="0"/>
+      <w:pageBreakBefore w:val="0"/>
+      <w:widowControl w:val="1"/>
       <w:pBdr>
         <w:top w:space="0" w:sz="0" w:val="nil"/>
         <w:left w:space="0" w:sz="0" w:val="nil"/>
@@ -1072,12 +1583,28 @@
         <w:right w:space="0" w:sz="0" w:val="nil"/>
         <w:between w:space="0" w:sz="0" w:val="nil"/>
       </w:pBdr>
+      <w:shd w:fill="auto" w:val="clear"/>
       <w:tabs>
         <w:tab w:val="center" w:leader="none" w:pos="4320"/>
         <w:tab w:val="right" w:leader="none" w:pos="8640"/>
       </w:tabs>
-      <w:rPr>
+      <w:spacing w:after="0" w:before="0" w:line="240" w:lineRule="auto"/>
+      <w:ind w:left="0" w:right="0" w:firstLine="0"/>
+      <w:jc w:val="left"/>
+      <w:rPr>
+        <w:rFonts w:ascii="Times New Roman" w:cs="Times New Roman" w:eastAsia="Times New Roman" w:hAnsi="Times New Roman"/>
+        <w:b w:val="0"/>
+        <w:bCs w:val="0"/>
+        <w:i w:val="0"/>
+        <w:iCs w:val="0"/>
+        <w:smallCaps w:val="0"/>
+        <w:strike w:val="0"/>
         <w:color w:val="000000"/>
+        <w:sz w:val="20"/>
+        <w:szCs w:val="20"/>
+        <w:u w:val="none"/>
+        <w:shd w:fill="auto" w:val="clear"/>
+        <w:vertAlign w:val="baseline"/>
       </w:rPr>
     </w:pPr>
     <w:r>
@@ -1093,6 +1620,10 @@
 <w:hdr xmlns:mc="http://schemas.openxmlformats.org/markup-compatibility/2006" xmlns:o="urn:schemas-microsoft-com:office:office" xmlns:r="http://schemas.openxmlformats.org/officeDocument/2006/relationships" xmlns:m="http://schemas.openxmlformats.org/officeDocument/2006/math" xmlns:v="urn:schemas-microsoft-com:vml" xmlns:wp="http://schemas.openxmlformats.org/drawingml/2006/wordprocessingDrawing" xmlns:w10="urn:schemas-microsoft-com:office:word" xmlns:w="http://schemas.openxmlformats.org/wordprocessingml/2006/main" xmlns:wne="http://schemas.microsoft.com/office/word/2006/wordml" xmlns:sl="http://schemas.openxmlformats.org/schemaLibrary/2006/main" xmlns:a="http://schemas.openxmlformats.org/drawingml/2006/main" xmlns:pic="http://schemas.openxmlformats.org/drawingml/2006/picture" xmlns:c="http://schemas.openxmlformats.org/drawingml/2006/chart" xmlns:lc="http://schemas.openxmlformats.org/drawingml/2006/lockedCanvas" xmlns:dgm="http://schemas.openxmlformats.org/drawingml/2006/diagram" xmlns:wps="http://schemas.microsoft.com/office/word/2010/wordprocessingShape" xmlns:wpg="http://schemas.microsoft.com/office/word/2010/wordprocessingGroup" xmlns:w14="http://schemas.microsoft.com/office/word/2010/wordml" xmlns:w15="http://schemas.microsoft.com/office/word/2012/wordml" xmlns:w16="http://schemas.microsoft.com/office/word/2018/wordml" xmlns:w16cex="http://schemas.microsoft.com/office/word/2018/wordml/cex" xmlns:w16cid="http://schemas.microsoft.com/office/word/2016/wordml/cid" xmlns="http://schemas.microsoft.com/office/tasks/2019/documenttasks" xmlns:cr="http://schemas.microsoft.com/office/comments/2020/reactions">
   <w:p>
     <w:pPr>
+      <w:keepNext w:val="0"/>
+      <w:keepLines w:val="0"/>
+      <w:pageBreakBefore w:val="0"/>
+      <w:widowControl w:val="1"/>
       <w:pBdr>
         <w:top w:space="0" w:sz="0" w:val="nil"/>
         <w:left w:space="0" w:sz="0" w:val="nil"/>
@@ -1100,20 +1631,28 @@
         <w:right w:space="0" w:sz="0" w:val="nil"/>
         <w:between w:space="0" w:sz="0" w:val="nil"/>
       </w:pBdr>
+      <w:shd w:fill="auto" w:val="clear"/>
       <w:tabs>
         <w:tab w:val="center" w:leader="none" w:pos="4320"/>
         <w:tab w:val="right" w:leader="none" w:pos="8640"/>
       </w:tabs>
-      <w:spacing w:after="60" w:lineRule="auto"/>
-      <w:ind w:right="360"/>
+      <w:spacing w:after="60" w:before="0" w:line="240" w:lineRule="auto"/>
+      <w:ind w:left="0" w:right="360" w:firstLine="0"/>
       <w:jc w:val="center"/>
       <w:rPr>
         <w:rFonts w:ascii="Cambria" w:cs="Cambria" w:eastAsia="Cambria" w:hAnsi="Cambria"/>
         <w:b w:val="1"/>
         <w:bCs w:val="1"/>
+        <w:i w:val="0"/>
+        <w:iCs w:val="0"/>
+        <w:smallCaps w:val="0"/>
+        <w:strike w:val="0"/>
         <w:color w:val="000000"/>
         <w:sz w:val="40"/>
         <w:szCs w:val="40"/>
+        <w:u w:val="none"/>
+        <w:shd w:fill="auto" w:val="clear"/>
+        <w:vertAlign w:val="baseline"/>
       </w:rPr>
     </w:pPr>
     <w:r>
@@ -1121,9 +1660,16 @@
         <w:rFonts w:ascii="Cambria" w:cs="Cambria" w:eastAsia="Cambria" w:hAnsi="Cambria"/>
         <w:b w:val="1"/>
         <w:bCs w:val="1"/>
+        <w:i w:val="0"/>
+        <w:iCs w:val="0"/>
+        <w:smallCaps w:val="0"/>
+        <w:strike w:val="0"/>
         <w:color w:val="000000"/>
         <w:sz w:val="40"/>
         <w:szCs w:val="40"/>
+        <w:u w:val="none"/>
+        <w:shd w:fill="auto" w:val="clear"/>
+        <w:vertAlign w:val="baseline"/>
         <w:rtl w:val="0"/>
       </w:rPr>
       <w:t xml:space="preserve">THE LAW GUYS, APC</w:t>
@@ -1131,6 +1677,10 @@
   </w:p>
   <w:p>
     <w:pPr>
+      <w:keepNext w:val="0"/>
+      <w:keepLines w:val="0"/>
+      <w:pageBreakBefore w:val="0"/>
+      <w:widowControl w:val="1"/>
       <w:pBdr>
         <w:top w:space="0" w:sz="0" w:val="nil"/>
         <w:left w:space="0" w:sz="0" w:val="nil"/>
@@ -1138,19 +1688,28 @@
         <w:right w:space="0" w:sz="0" w:val="nil"/>
         <w:between w:space="0" w:sz="0" w:val="nil"/>
       </w:pBdr>
+      <w:shd w:fill="auto" w:val="clear"/>
       <w:tabs>
         <w:tab w:val="center" w:leader="none" w:pos="4320"/>
         <w:tab w:val="right" w:leader="none" w:pos="8640"/>
       </w:tabs>
-      <w:ind w:right="360"/>
+      <w:spacing w:after="0" w:before="0" w:line="240" w:lineRule="auto"/>
+      <w:ind w:left="0" w:right="360" w:firstLine="0"/>
       <w:jc w:val="center"/>
       <w:rPr>
         <w:rFonts w:ascii="Calibri" w:cs="Calibri" w:eastAsia="Calibri" w:hAnsi="Calibri"/>
         <w:b w:val="1"/>
         <w:bCs w:val="1"/>
+        <w:i w:val="0"/>
+        <w:iCs w:val="0"/>
+        <w:smallCaps w:val="0"/>
+        <w:strike w:val="0"/>
         <w:color w:val="000000"/>
         <w:sz w:val="28"/>
         <w:szCs w:val="28"/>
+        <w:u w:val="none"/>
+        <w:shd w:fill="auto" w:val="clear"/>
+        <w:vertAlign w:val="baseline"/>
       </w:rPr>
     </w:pPr>
     <w:r>
@@ -1158,9 +1717,16 @@
         <w:rFonts w:ascii="Calibri" w:cs="Calibri" w:eastAsia="Calibri" w:hAnsi="Calibri"/>
         <w:b w:val="1"/>
         <w:bCs w:val="1"/>
+        <w:i w:val="0"/>
+        <w:iCs w:val="0"/>
+        <w:smallCaps w:val="0"/>
+        <w:strike w:val="0"/>
         <w:color w:val="000000"/>
         <w:sz w:val="28"/>
         <w:szCs w:val="28"/>
+        <w:u w:val="none"/>
+        <w:shd w:fill="auto" w:val="clear"/>
+        <w:vertAlign w:val="baseline"/>
         <w:rtl w:val="0"/>
       </w:rPr>
       <w:t xml:space="preserve">4231 Balboa Avenue #1261, San Diego, CA 92117</w:t>
@@ -1168,6 +1734,10 @@
   </w:p>
   <w:p>
     <w:pPr>
+      <w:keepNext w:val="0"/>
+      <w:keepLines w:val="0"/>
+      <w:pageBreakBefore w:val="0"/>
+      <w:widowControl w:val="1"/>
       <w:pBdr>
         <w:top w:space="0" w:sz="0" w:val="nil"/>
         <w:left w:space="0" w:sz="0" w:val="nil"/>
@@ -1175,15 +1745,28 @@
         <w:right w:space="0" w:sz="0" w:val="nil"/>
         <w:between w:space="0" w:sz="0" w:val="nil"/>
       </w:pBdr>
+      <w:shd w:fill="auto" w:val="clear"/>
       <w:tabs>
         <w:tab w:val="center" w:leader="none" w:pos="4320"/>
         <w:tab w:val="right" w:leader="none" w:pos="8640"/>
       </w:tabs>
-      <w:ind w:right="360"/>
+      <w:spacing w:after="0" w:before="0" w:line="240" w:lineRule="auto"/>
+      <w:ind w:left="0" w:right="360" w:firstLine="0"/>
       <w:jc w:val="center"/>
       <w:rPr>
         <w:rFonts w:ascii="DISCO" w:cs="DISCO" w:eastAsia="DISCO" w:hAnsi="DISCO"/>
+        <w:b w:val="0"/>
+        <w:bCs w:val="0"/>
+        <w:i w:val="0"/>
+        <w:iCs w:val="0"/>
+        <w:smallCaps w:val="0"/>
+        <w:strike w:val="0"/>
         <w:color w:val="000000"/>
+        <w:sz w:val="20"/>
+        <w:szCs w:val="20"/>
+        <w:u w:val="none"/>
+        <w:shd w:fill="auto" w:val="clear"/>
+        <w:vertAlign w:val="baseline"/>
       </w:rPr>
     </w:pPr>
     <w:r>
@@ -1194,6 +1777,10 @@
   </w:p>
   <w:p>
     <w:pPr>
+      <w:keepNext w:val="0"/>
+      <w:keepLines w:val="0"/>
+      <w:pageBreakBefore w:val="0"/>
+      <w:widowControl w:val="1"/>
       <w:pBdr>
         <w:top w:space="0" w:sz="0" w:val="nil"/>
         <w:left w:space="0" w:sz="0" w:val="nil"/>
@@ -1201,25 +1788,45 @@
         <w:right w:space="0" w:sz="0" w:val="nil"/>
         <w:between w:space="0" w:sz="0" w:val="nil"/>
       </w:pBdr>
+      <w:shd w:fill="auto" w:val="clear"/>
       <w:tabs>
         <w:tab w:val="center" w:leader="none" w:pos="4320"/>
         <w:tab w:val="right" w:leader="none" w:pos="8640"/>
       </w:tabs>
-      <w:ind w:right="360"/>
+      <w:spacing w:after="0" w:before="0" w:line="240" w:lineRule="auto"/>
+      <w:ind w:left="0" w:right="360" w:firstLine="0"/>
       <w:jc w:val="center"/>
       <w:rPr>
         <w:rFonts w:ascii="Calibri" w:cs="Calibri" w:eastAsia="Calibri" w:hAnsi="Calibri"/>
+        <w:b w:val="0"/>
+        <w:bCs w:val="0"/>
+        <w:i w:val="0"/>
+        <w:iCs w:val="0"/>
+        <w:smallCaps w:val="0"/>
+        <w:strike w:val="0"/>
         <w:color w:val="000000"/>
         <w:sz w:val="24"/>
         <w:szCs w:val="24"/>
+        <w:u w:val="none"/>
+        <w:shd w:fill="auto" w:val="clear"/>
+        <w:vertAlign w:val="baseline"/>
       </w:rPr>
     </w:pPr>
     <w:r>
       <w:rPr>
         <w:rFonts w:ascii="Calibri" w:cs="Calibri" w:eastAsia="Calibri" w:hAnsi="Calibri"/>
+        <w:b w:val="0"/>
+        <w:bCs w:val="0"/>
+        <w:i w:val="0"/>
+        <w:iCs w:val="0"/>
+        <w:smallCaps w:val="0"/>
+        <w:strike w:val="0"/>
         <w:color w:val="000000"/>
         <w:sz w:val="24"/>
         <w:szCs w:val="24"/>
+        <w:u w:val="none"/>
+        <w:shd w:fill="auto" w:val="clear"/>
+        <w:vertAlign w:val="baseline"/>
         <w:rtl w:val="0"/>
       </w:rPr>
       <w:t xml:space="preserve">Andrew Athanassious | (916) 587-1457 | legal@thelawguys.com</w:t>
@@ -1227,6 +1834,10 @@
   </w:p>
   <w:p>
     <w:pPr>
+      <w:keepNext w:val="0"/>
+      <w:keepLines w:val="0"/>
+      <w:pageBreakBefore w:val="0"/>
+      <w:widowControl w:val="1"/>
       <w:pBdr>
         <w:top w:space="0" w:sz="0" w:val="nil"/>
         <w:left w:space="0" w:sz="0" w:val="nil"/>
@@ -1234,17 +1845,28 @@
         <w:right w:space="0" w:sz="0" w:val="nil"/>
         <w:between w:space="0" w:sz="0" w:val="nil"/>
       </w:pBdr>
+      <w:shd w:fill="auto" w:val="clear"/>
       <w:tabs>
         <w:tab w:val="center" w:leader="none" w:pos="4320"/>
         <w:tab w:val="right" w:leader="none" w:pos="8640"/>
       </w:tabs>
-      <w:ind w:right="360"/>
+      <w:spacing w:after="0" w:before="0" w:line="240" w:lineRule="auto"/>
+      <w:ind w:left="0" w:right="360" w:firstLine="0"/>
       <w:jc w:val="center"/>
       <w:rPr>
         <w:rFonts w:ascii="ColaborateLight" w:cs="ColaborateLight" w:eastAsia="ColaborateLight" w:hAnsi="ColaborateLight"/>
+        <w:b w:val="0"/>
+        <w:bCs w:val="0"/>
+        <w:i w:val="0"/>
+        <w:iCs w:val="0"/>
+        <w:smallCaps w:val="0"/>
+        <w:strike w:val="0"/>
         <w:color w:val="000000"/>
         <w:sz w:val="24"/>
         <w:szCs w:val="24"/>
+        <w:u w:val="none"/>
+        <w:shd w:fill="auto" w:val="clear"/>
+        <w:vertAlign w:val="baseline"/>
       </w:rPr>
     </w:pPr>
     <w:r>
@@ -1260,6 +1882,10 @@
 <w:hdr xmlns:mc="http://schemas.openxmlformats.org/markup-compatibility/2006" xmlns:o="urn:schemas-microsoft-com:office:office" xmlns:r="http://schemas.openxmlformats.org/officeDocument/2006/relationships" xmlns:m="http://schemas.openxmlformats.org/officeDocument/2006/math" xmlns:v="urn:schemas-microsoft-com:vml" xmlns:wp="http://schemas.openxmlformats.org/drawingml/2006/wordprocessingDrawing" xmlns:w10="urn:schemas-microsoft-com:office:word" xmlns:w="http://schemas.openxmlformats.org/wordprocessingml/2006/main" xmlns:wne="http://schemas.microsoft.com/office/word/2006/wordml" xmlns:sl="http://schemas.openxmlformats.org/schemaLibrary/2006/main" xmlns:a="http://schemas.openxmlformats.org/drawingml/2006/main" xmlns:pic="http://schemas.openxmlformats.org/drawingml/2006/picture" xmlns:c="http://schemas.openxmlformats.org/drawingml/2006/chart" xmlns:lc="http://schemas.openxmlformats.org/drawingml/2006/lockedCanvas" xmlns:dgm="http://schemas.openxmlformats.org/drawingml/2006/diagram" xmlns:wps="http://schemas.microsoft.com/office/word/2010/wordprocessingShape" xmlns:wpg="http://schemas.microsoft.com/office/word/2010/wordprocessingGroup" xmlns:w14="http://schemas.microsoft.com/office/word/2010/wordml" xmlns:w15="http://schemas.microsoft.com/office/word/2012/wordml" xmlns:w16="http://schemas.microsoft.com/office/word/2018/wordml" xmlns:w16cex="http://schemas.microsoft.com/office/word/2018/wordml/cex" xmlns:w16cid="http://schemas.microsoft.com/office/word/2016/wordml/cid" xmlns="http://schemas.microsoft.com/office/tasks/2019/documenttasks" xmlns:cr="http://schemas.microsoft.com/office/comments/2020/reactions">
   <w:p>
     <w:pPr>
+      <w:keepNext w:val="0"/>
+      <w:keepLines w:val="0"/>
+      <w:pageBreakBefore w:val="0"/>
+      <w:widowControl w:val="1"/>
       <w:pBdr>
         <w:top w:space="0" w:sz="0" w:val="nil"/>
         <w:left w:space="0" w:sz="0" w:val="nil"/>
@@ -1267,12 +1893,28 @@
         <w:right w:space="0" w:sz="0" w:val="nil"/>
         <w:between w:space="0" w:sz="0" w:val="nil"/>
       </w:pBdr>
+      <w:shd w:fill="auto" w:val="clear"/>
       <w:tabs>
         <w:tab w:val="center" w:leader="none" w:pos="4320"/>
         <w:tab w:val="right" w:leader="none" w:pos="8640"/>
       </w:tabs>
-      <w:rPr>
+      <w:spacing w:after="0" w:before="0" w:line="240" w:lineRule="auto"/>
+      <w:ind w:left="0" w:right="0" w:firstLine="0"/>
+      <w:jc w:val="left"/>
+      <w:rPr>
+        <w:rFonts w:ascii="Times New Roman" w:cs="Times New Roman" w:eastAsia="Times New Roman" w:hAnsi="Times New Roman"/>
+        <w:b w:val="0"/>
+        <w:bCs w:val="0"/>
+        <w:i w:val="0"/>
+        <w:iCs w:val="0"/>
+        <w:smallCaps w:val="0"/>
+        <w:strike w:val="0"/>
         <w:color w:val="000000"/>
+        <w:sz w:val="20"/>
+        <w:szCs w:val="20"/>
+        <w:u w:val="none"/>
+        <w:shd w:fill="auto" w:val="clear"/>
+        <w:vertAlign w:val="baseline"/>
       </w:rPr>
     </w:pPr>
     <w:r>
@@ -1288,6 +1930,10 @@
 <w:hdr xmlns:mc="http://schemas.openxmlformats.org/markup-compatibility/2006" xmlns:o="urn:schemas-microsoft-com:office:office" xmlns:r="http://schemas.openxmlformats.org/officeDocument/2006/relationships" xmlns:m="http://schemas.openxmlformats.org/officeDocument/2006/math" xmlns:v="urn:schemas-microsoft-com:vml" xmlns:wp="http://schemas.openxmlformats.org/drawingml/2006/wordprocessingDrawing" xmlns:w10="urn:schemas-microsoft-com:office:word" xmlns:w="http://schemas.openxmlformats.org/wordprocessingml/2006/main" xmlns:wne="http://schemas.microsoft.com/office/word/2006/wordml" xmlns:sl="http://schemas.openxmlformats.org/schemaLibrary/2006/main" xmlns:a="http://schemas.openxmlformats.org/drawingml/2006/main" xmlns:pic="http://schemas.openxmlformats.org/drawingml/2006/picture" xmlns:c="http://schemas.openxmlformats.org/drawingml/2006/chart" xmlns:lc="http://schemas.openxmlformats.org/drawingml/2006/lockedCanvas" xmlns:dgm="http://schemas.openxmlformats.org/drawingml/2006/diagram" xmlns:wps="http://schemas.microsoft.com/office/word/2010/wordprocessingShape" xmlns:wpg="http://schemas.microsoft.com/office/word/2010/wordprocessingGroup" xmlns:w14="http://schemas.microsoft.com/office/word/2010/wordml" xmlns:w15="http://schemas.microsoft.com/office/word/2012/wordml" xmlns:w16="http://schemas.microsoft.com/office/word/2018/wordml" xmlns:w16cex="http://schemas.microsoft.com/office/word/2018/wordml/cex" xmlns:w16cid="http://schemas.microsoft.com/office/word/2016/wordml/cid" xmlns="http://schemas.microsoft.com/office/tasks/2019/documenttasks" xmlns:cr="http://schemas.microsoft.com/office/comments/2020/reactions">
   <w:p>
     <w:pPr>
+      <w:keepNext w:val="0"/>
+      <w:keepLines w:val="0"/>
+      <w:pageBreakBefore w:val="0"/>
+      <w:widowControl w:val="1"/>
       <w:pBdr>
         <w:top w:space="0" w:sz="0" w:val="nil"/>
         <w:left w:space="0" w:sz="0" w:val="nil"/>
@@ -1295,19 +1941,28 @@
         <w:right w:space="0" w:sz="0" w:val="nil"/>
         <w:between w:space="0" w:sz="0" w:val="nil"/>
       </w:pBdr>
+      <w:shd w:fill="auto" w:val="clear"/>
       <w:tabs>
         <w:tab w:val="center" w:leader="none" w:pos="4320"/>
         <w:tab w:val="right" w:leader="none" w:pos="8640"/>
       </w:tabs>
-      <w:ind w:right="360"/>
+      <w:spacing w:after="0" w:before="0" w:line="240" w:lineRule="auto"/>
+      <w:ind w:left="0" w:right="360" w:firstLine="0"/>
       <w:jc w:val="center"/>
       <w:rPr>
         <w:rFonts w:ascii="Cambria" w:cs="Cambria" w:eastAsia="Cambria" w:hAnsi="Cambria"/>
         <w:b w:val="1"/>
         <w:bCs w:val="1"/>
+        <w:i w:val="0"/>
+        <w:iCs w:val="0"/>
+        <w:smallCaps w:val="0"/>
+        <w:strike w:val="0"/>
         <w:color w:val="000000"/>
         <w:sz w:val="36"/>
         <w:szCs w:val="36"/>
+        <w:u w:val="none"/>
+        <w:shd w:fill="auto" w:val="clear"/>
+        <w:vertAlign w:val="baseline"/>
       </w:rPr>
     </w:pPr>
     <w:r>
@@ -1315,9 +1970,16 @@
         <w:rFonts w:ascii="Cambria" w:cs="Cambria" w:eastAsia="Cambria" w:hAnsi="Cambria"/>
         <w:b w:val="1"/>
         <w:bCs w:val="1"/>
+        <w:i w:val="0"/>
+        <w:iCs w:val="0"/>
+        <w:smallCaps w:val="0"/>
+        <w:strike w:val="0"/>
         <w:color w:val="000000"/>
         <w:sz w:val="36"/>
         <w:szCs w:val="36"/>
+        <w:u w:val="none"/>
+        <w:shd w:fill="auto" w:val="clear"/>
+        <w:vertAlign w:val="baseline"/>
         <w:rtl w:val="0"/>
       </w:rPr>
       <w:t xml:space="preserve">THE LAW GUYS, APC</w:t>
@@ -1325,6 +1987,10 @@
   </w:p>
   <w:p>
     <w:pPr>
+      <w:keepNext w:val="0"/>
+      <w:keepLines w:val="0"/>
+      <w:pageBreakBefore w:val="0"/>
+      <w:widowControl w:val="1"/>
       <w:pBdr>
         <w:top w:space="0" w:sz="0" w:val="nil"/>
         <w:left w:space="0" w:sz="0" w:val="nil"/>
@@ -1332,14 +1998,28 @@
         <w:right w:space="0" w:sz="0" w:val="nil"/>
         <w:between w:space="0" w:sz="0" w:val="nil"/>
       </w:pBdr>
+      <w:shd w:fill="auto" w:val="clear"/>
       <w:tabs>
         <w:tab w:val="center" w:leader="none" w:pos="4320"/>
         <w:tab w:val="right" w:leader="none" w:pos="8640"/>
       </w:tabs>
-      <w:ind w:right="360"/>
+      <w:spacing w:after="0" w:before="0" w:line="240" w:lineRule="auto"/>
+      <w:ind w:left="0" w:right="360" w:firstLine="0"/>
       <w:jc w:val="center"/>
       <w:rPr>
+        <w:rFonts w:ascii="Times New Roman" w:cs="Times New Roman" w:eastAsia="Times New Roman" w:hAnsi="Times New Roman"/>
+        <w:b w:val="0"/>
+        <w:bCs w:val="0"/>
+        <w:i w:val="0"/>
+        <w:iCs w:val="0"/>
+        <w:smallCaps w:val="0"/>
+        <w:strike w:val="0"/>
         <w:color w:val="000000"/>
+        <w:sz w:val="20"/>
+        <w:szCs w:val="20"/>
+        <w:u w:val="none"/>
+        <w:shd w:fill="auto" w:val="clear"/>
+        <w:vertAlign w:val="baseline"/>
       </w:rPr>
     </w:pPr>
     <w:r>
@@ -1437,6 +2117,10 @@
 <w:hdr xmlns:mc="http://schemas.openxmlformats.org/markup-compatibility/2006" xmlns:o="urn:schemas-microsoft-com:office:office" xmlns:r="http://schemas.openxmlformats.org/officeDocument/2006/relationships" xmlns:m="http://schemas.openxmlformats.org/officeDocument/2006/math" xmlns:v="urn:schemas-microsoft-com:vml" xmlns:wp="http://schemas.openxmlformats.org/drawingml/2006/wordprocessingDrawing" xmlns:w10="urn:schemas-microsoft-com:office:word" xmlns:w="http://schemas.openxmlformats.org/wordprocessingml/2006/main" xmlns:wne="http://schemas.microsoft.com/office/word/2006/wordml" xmlns:sl="http://schemas.openxmlformats.org/schemaLibrary/2006/main" xmlns:a="http://schemas.openxmlformats.org/drawingml/2006/main" xmlns:pic="http://schemas.openxmlformats.org/drawingml/2006/picture" xmlns:c="http://schemas.openxmlformats.org/drawingml/2006/chart" xmlns:lc="http://schemas.openxmlformats.org/drawingml/2006/lockedCanvas" xmlns:dgm="http://schemas.openxmlformats.org/drawingml/2006/diagram" xmlns:wps="http://schemas.microsoft.com/office/word/2010/wordprocessingShape" xmlns:wpg="http://schemas.microsoft.com/office/word/2010/wordprocessingGroup" xmlns:w14="http://schemas.microsoft.com/office/word/2010/wordml" xmlns:w15="http://schemas.microsoft.com/office/word/2012/wordml" xmlns:w16="http://schemas.microsoft.com/office/word/2018/wordml" xmlns:w16cex="http://schemas.microsoft.com/office/word/2018/wordml/cex" xmlns:w16cid="http://schemas.microsoft.com/office/word/2016/wordml/cid" xmlns="http://schemas.microsoft.com/office/tasks/2019/documenttasks" xmlns:cr="http://schemas.microsoft.com/office/comments/2020/reactions">
   <w:p>
     <w:pPr>
+      <w:keepNext w:val="0"/>
+      <w:keepLines w:val="0"/>
+      <w:pageBreakBefore w:val="0"/>
+      <w:widowControl w:val="1"/>
       <w:pBdr>
         <w:top w:space="0" w:sz="0" w:val="nil"/>
         <w:left w:space="0" w:sz="0" w:val="nil"/>
@@ -1444,12 +2128,28 @@
         <w:right w:space="0" w:sz="0" w:val="nil"/>
         <w:between w:space="0" w:sz="0" w:val="nil"/>
       </w:pBdr>
+      <w:shd w:fill="auto" w:val="clear"/>
       <w:tabs>
         <w:tab w:val="center" w:leader="none" w:pos="4320"/>
         <w:tab w:val="right" w:leader="none" w:pos="8640"/>
       </w:tabs>
-      <w:rPr>
+      <w:spacing w:after="0" w:before="0" w:line="240" w:lineRule="auto"/>
+      <w:ind w:left="0" w:right="0" w:firstLine="0"/>
+      <w:jc w:val="left"/>
+      <w:rPr>
+        <w:rFonts w:ascii="Times New Roman" w:cs="Times New Roman" w:eastAsia="Times New Roman" w:hAnsi="Times New Roman"/>
+        <w:b w:val="0"/>
+        <w:bCs w:val="0"/>
+        <w:i w:val="0"/>
+        <w:iCs w:val="0"/>
+        <w:smallCaps w:val="0"/>
+        <w:strike w:val="0"/>
         <w:color w:val="000000"/>
+        <w:sz w:val="20"/>
+        <w:szCs w:val="20"/>
+        <w:u w:val="none"/>
+        <w:shd w:fill="auto" w:val="clear"/>
+        <w:vertAlign w:val="baseline"/>
       </w:rPr>
     </w:pPr>
     <w:r>
@@ -1498,6 +2198,7 @@
     <w:pPr>
       <w:keepNext w:val="1"/>
       <w:keepLines w:val="1"/>
+      <w:pageBreakBefore w:val="0"/>
       <w:spacing w:after="120" w:before="480" w:lineRule="auto"/>
     </w:pPr>
     <w:rPr>
@@ -1514,6 +2215,7 @@
     <w:pPr>
       <w:keepNext w:val="1"/>
       <w:keepLines w:val="1"/>
+      <w:pageBreakBefore w:val="0"/>
       <w:spacing w:after="80" w:before="360" w:lineRule="auto"/>
     </w:pPr>
     <w:rPr>
@@ -1530,6 +2232,7 @@
     <w:pPr>
       <w:keepNext w:val="1"/>
       <w:keepLines w:val="1"/>
+      <w:pageBreakBefore w:val="0"/>
       <w:spacing w:after="80" w:before="280" w:lineRule="auto"/>
     </w:pPr>
     <w:rPr>
@@ -1546,6 +2249,7 @@
     <w:pPr>
       <w:keepNext w:val="1"/>
       <w:keepLines w:val="1"/>
+      <w:pageBreakBefore w:val="0"/>
       <w:spacing w:after="40" w:before="240" w:lineRule="auto"/>
     </w:pPr>
     <w:rPr>
@@ -1562,6 +2266,7 @@
     <w:pPr>
       <w:keepNext w:val="1"/>
       <w:keepLines w:val="1"/>
+      <w:pageBreakBefore w:val="0"/>
       <w:spacing w:after="40" w:before="220" w:lineRule="auto"/>
     </w:pPr>
     <w:rPr>
@@ -1578,11 +2283,14 @@
     <w:pPr>
       <w:keepNext w:val="1"/>
       <w:keepLines w:val="1"/>
+      <w:pageBreakBefore w:val="0"/>
       <w:spacing w:after="40" w:before="200" w:lineRule="auto"/>
     </w:pPr>
     <w:rPr>
       <w:b w:val="1"/>
       <w:bCs w:val="1"/>
+      <w:sz w:val="20"/>
+      <w:szCs w:val="20"/>
     </w:rPr>
   </w:style>
   <w:style w:type="paragraph" w:styleId="Title">
@@ -1592,6 +2300,7 @@
     <w:pPr>
       <w:keepNext w:val="1"/>
       <w:keepLines w:val="1"/>
+      <w:pageBreakBefore w:val="0"/>
       <w:spacing w:after="120" w:before="480" w:lineRule="auto"/>
     </w:pPr>
     <w:rPr>
@@ -1716,6 +2425,22 @@
       <w:szCs w:val="16"/>
     </w:rPr>
   </w:style>
+  <w:style w:type="paragraph" w:styleId="NormalWeb">
+    <w:name w:val="Normal (Web)"/>
+    <w:basedOn w:val="Normal"/>
+    <w:uiPriority w:val="99"/>
+    <w:unhideWhenUsed w:val="1"/>
+    <w:rsid w:val="00DC241D"/>
+    <w:pPr>
+      <w:autoSpaceDE w:val="1"/>
+      <w:autoSpaceDN w:val="1"/>
+      <w:adjustRightInd w:val="1"/>
+      <w:spacing w:after="100" w:afterAutospacing="1" w:before="100" w:beforeAutospacing="1"/>
+    </w:pPr>
+    <w:rPr>
+      <w:sz w:val="24"/>
+    </w:rPr>
+  </w:style>
   <w:style w:type="paragraph" w:styleId="Subtitle">
     <w:name w:val="Subtitle"/>
     <w:basedOn w:val="Normal"/>
@@ -1723,6 +2448,7 @@
     <w:pPr>
       <w:keepNext w:val="1"/>
       <w:keepLines w:val="1"/>
+      <w:pageBreakBefore w:val="0"/>
       <w:spacing w:after="80" w:before="360" w:lineRule="auto"/>
     </w:pPr>
     <w:rPr>
@@ -2022,7 +2748,7 @@
 
 <file path=customXML/item1.xml><?xml version="1.0" encoding="utf-8"?>
 <go:gDocsCustomXmlDataStorage xmlns:go="http://customooxmlschemas.google.com/" xmlns:r="http://schemas.openxmlformats.org/officeDocument/2006/relationships" uri="GoogleDocsCustomDataVersion2">
-  <go:docsCustomData xmlns:go="http://customooxmlschemas.google.com/" roundtripDataSignature="AMtx7mi65+RuY1H21+WOqbFdpP0fgk+5dQ==">CgMxLjA4AHIhMVFLSkoxSEtlTFdyNzNUeEZteVNNS0NwN05pc3VGYW5T</go:docsCustomData>
+  <go:docsCustomData xmlns:go="http://customooxmlschemas.google.com/" roundtripDataSignature="AMtx7mgkeJVtYQLe4osu1FZWH9lp2pckEw==">CgMxLjA4AHIhMTZtZkk5ZWVhYXBidTRqLTVYNHlVQW9NcXhGNm1hejNN</go:docsCustomData>
 </go:gDocsCustomXmlDataStorage>
 </file>
 

</xml_diff>

<commit_message>
Fixing issues and ready to deploy
</commit_message>
<xml_diff>
--- a/Template.docx
+++ b/Template.docx
@@ -563,7 +563,35 @@
           <w:vertAlign w:val="baseline"/>
           <w:rtl w:val="0"/>
         </w:rPr>
-        <w:t xml:space="preserve"> is, therefore, demanding payment of his full wages and associated penalties.</w:t>
+        <w:t xml:space="preserve"> is, therefore, demanding payment of </w:t>
+      </w:r>
+      <w:r>
+        <w:rPr>
+          <w:rFonts w:ascii="Garamond" w:cs="Garamond" w:eastAsia="Garamond" w:hAnsi="Garamond"/>
+          <w:sz w:val="24"/>
+          <w:szCs w:val="24"/>
+          <w:rtl w:val="0"/>
+        </w:rPr>
+        <w:t xml:space="preserve">{{possessive}}</w:t>
+      </w:r>
+      <w:r>
+        <w:rPr>
+          <w:rFonts w:ascii="Garamond" w:cs="Garamond" w:eastAsia="Garamond" w:hAnsi="Garamond"/>
+          <w:b w:val="0"/>
+          <w:bCs w:val="0"/>
+          <w:i w:val="0"/>
+          <w:iCs w:val="0"/>
+          <w:smallCaps w:val="0"/>
+          <w:strike w:val="0"/>
+          <w:color w:val="000000"/>
+          <w:sz w:val="24"/>
+          <w:szCs w:val="24"/>
+          <w:u w:val="none"/>
+          <w:shd w:fill="auto" w:val="clear"/>
+          <w:vertAlign w:val="baseline"/>
+          <w:rtl w:val="0"/>
+        </w:rPr>
+        <w:t xml:space="preserve"> full wages and associated penalties.</w:t>
       </w:r>
     </w:p>
     <w:p>
@@ -601,7 +629,7 @@
           <w:szCs w:val="24"/>
           <w:rtl w:val="0"/>
         </w:rPr>
-        <w:t xml:space="preserve">California Labor Code section 204 provides that payment for all wages earned by an employee during the course of his employment are due and payable twice each calendar month.  An employer’s failure to pay wages results in a penalty of $100 for the first violation and $200 for each additional violation, plus 25% of the amount unlawfully withheld. (Cal. Labor Code § 210.)  Additionally, California Labor Code section 226(a) requires employers to furnish their employees with accurate itemized statements showing the total hours worked by the employee for each pay period.  Any failure to accurately furnish this information renders the employer liable for actual damages, or $50.00 for the first violation and $100.00 for each additional violation, whichever is greater. Finally, Mr. Simcox is entitled to recover reasonable costs and attorney’s fees. (Cal. Labor Code § 218.5.)</w:t>
+        <w:t xml:space="preserve">California Labor Code section 204 provides that payment for all wages earned by an employee during the course of {{possessive}} employment are due and payable twice each calendar month.  An employer’s failure to pay wages results in a penalty of $100 for the first violation and $200 for each additional violation, plus 25% of the amount unlawfully withheld. (Cal. Labor Code § 210.)  Additionally, California Labor Code section 226(a) requires employers to furnish their employees with accurate itemized statements showing the total hours worked by the employee for each pay period.  Any failure to accurately furnish this information renders the employer liable for actual damages, or $50.00 for the first violation and $100.00 for each additional violation, whichever is greater. Finally, Mr. Simcox is entitled to recover reasonable costs and attorney’s fees. (Cal. Labor Code § 218.5.)</w:t>
       </w:r>
     </w:p>
     <w:p>

</xml_diff>